<commit_message>
Added toggle class function
Added a toggle function for clearer code, this will be implemented in the previous javascript later on.
</commit_message>
<xml_diff>
--- a/documentation/CRM-HKR-2026_Lab2_documentation/CRM-HKR-2026_Lab2.docx
+++ b/documentation/CRM-HKR-2026_Lab2_documentation/CRM-HKR-2026_Lab2.docx
@@ -579,25 +579,7 @@
           <w:b/>
           <w:bCs/>
         </w:rPr>
-        <w:t xml:space="preserve">Evidence </w:t>
-      </w:r>
-      <w:proofErr w:type="gramStart"/>
-      <w:r>
-        <w:rPr>
-          <w:rFonts w:ascii="Times New Roman" w:hAnsi="Times New Roman" w:cs="Times New Roman"/>
-          <w:b/>
-          <w:bCs/>
-        </w:rPr>
-        <w:t>form</w:t>
-      </w:r>
-      <w:proofErr w:type="gramEnd"/>
-      <w:r>
-        <w:rPr>
-          <w:rFonts w:ascii="Times New Roman" w:hAnsi="Times New Roman" w:cs="Times New Roman"/>
-          <w:b/>
-          <w:bCs/>
-        </w:rPr>
-        <w:t xml:space="preserve"> validation:</w:t>
+        <w:t>Evidence form validation:</w:t>
       </w:r>
     </w:p>
     <w:p>
@@ -1308,61 +1290,7 @@
           <w:sz w:val="22"/>
           <w:szCs w:val="22"/>
         </w:rPr>
-        <w:t xml:space="preserve">Main function: </w:t>
-      </w:r>
-      <w:proofErr w:type="spellStart"/>
-      <w:r>
-        <w:rPr>
-          <w:rFonts w:ascii="Times New Roman" w:hAnsi="Times New Roman" w:cs="Times New Roman"/>
-          <w:sz w:val="22"/>
-          <w:szCs w:val="22"/>
-        </w:rPr>
-        <w:t>clickAndShow</w:t>
-      </w:r>
-      <w:proofErr w:type="spellEnd"/>
-      <w:r>
-        <w:rPr>
-          <w:rFonts w:ascii="Times New Roman" w:hAnsi="Times New Roman" w:cs="Times New Roman"/>
-          <w:sz w:val="22"/>
-          <w:szCs w:val="22"/>
-        </w:rPr>
-        <w:t>(</w:t>
-      </w:r>
-      <w:proofErr w:type="spellStart"/>
-      <w:r>
-        <w:rPr>
-          <w:rFonts w:ascii="Times New Roman" w:hAnsi="Times New Roman" w:cs="Times New Roman"/>
-          <w:sz w:val="22"/>
-          <w:szCs w:val="22"/>
-        </w:rPr>
-        <w:t>showMe</w:t>
-      </w:r>
-      <w:proofErr w:type="spellEnd"/>
-      <w:r>
-        <w:rPr>
-          <w:rFonts w:ascii="Times New Roman" w:hAnsi="Times New Roman" w:cs="Times New Roman"/>
-          <w:sz w:val="22"/>
-          <w:szCs w:val="22"/>
-        </w:rPr>
-        <w:t xml:space="preserve">, </w:t>
-      </w:r>
-      <w:proofErr w:type="spellStart"/>
-      <w:r>
-        <w:rPr>
-          <w:rFonts w:ascii="Times New Roman" w:hAnsi="Times New Roman" w:cs="Times New Roman"/>
-          <w:sz w:val="22"/>
-          <w:szCs w:val="22"/>
-        </w:rPr>
-        <w:t>hideMe</w:t>
-      </w:r>
-      <w:proofErr w:type="spellEnd"/>
-      <w:r>
-        <w:rPr>
-          <w:rFonts w:ascii="Times New Roman" w:hAnsi="Times New Roman" w:cs="Times New Roman"/>
-          <w:sz w:val="22"/>
-          <w:szCs w:val="22"/>
-        </w:rPr>
-        <w:t>)</w:t>
+        <w:t>Main function: clickAndShow(showMe, hideMe)</w:t>
       </w:r>
     </w:p>
     <w:p>
@@ -1417,25 +1345,7 @@
           <w:sz w:val="22"/>
           <w:szCs w:val="22"/>
         </w:rPr>
-        <w:t xml:space="preserve">1. </w:t>
-      </w:r>
-      <w:proofErr w:type="spellStart"/>
-      <w:r>
-        <w:rPr>
-          <w:rFonts w:ascii="Times New Roman" w:hAnsi="Times New Roman" w:cs="Times New Roman"/>
-          <w:sz w:val="22"/>
-          <w:szCs w:val="22"/>
-        </w:rPr>
-        <w:t>addEventListener</w:t>
-      </w:r>
-      <w:proofErr w:type="spellEnd"/>
-      <w:r>
-        <w:rPr>
-          <w:rFonts w:ascii="Times New Roman" w:hAnsi="Times New Roman" w:cs="Times New Roman"/>
-          <w:sz w:val="22"/>
-          <w:szCs w:val="22"/>
-        </w:rPr>
-        <w:t xml:space="preserve"> "click” detects when the user clicks the button.</w:t>
+        <w:t>1. addEventListener "click” detects when the user clicks the button.</w:t>
       </w:r>
     </w:p>
     <w:p>
@@ -1454,61 +1364,7 @@
           <w:sz w:val="22"/>
           <w:szCs w:val="22"/>
         </w:rPr>
-        <w:t xml:space="preserve">2. The event calls </w:t>
-      </w:r>
-      <w:proofErr w:type="spellStart"/>
-      <w:r>
-        <w:rPr>
-          <w:rFonts w:ascii="Times New Roman" w:hAnsi="Times New Roman" w:cs="Times New Roman"/>
-          <w:sz w:val="22"/>
-          <w:szCs w:val="22"/>
-        </w:rPr>
-        <w:t>clickAndShow</w:t>
-      </w:r>
-      <w:proofErr w:type="spellEnd"/>
-      <w:r>
-        <w:rPr>
-          <w:rFonts w:ascii="Times New Roman" w:hAnsi="Times New Roman" w:cs="Times New Roman"/>
-          <w:sz w:val="22"/>
-          <w:szCs w:val="22"/>
-        </w:rPr>
-        <w:t>(</w:t>
-      </w:r>
-      <w:proofErr w:type="spellStart"/>
-      <w:r>
-        <w:rPr>
-          <w:rFonts w:ascii="Times New Roman" w:hAnsi="Times New Roman" w:cs="Times New Roman"/>
-          <w:sz w:val="22"/>
-          <w:szCs w:val="22"/>
-        </w:rPr>
-        <w:t>fullTxt</w:t>
-      </w:r>
-      <w:proofErr w:type="spellEnd"/>
-      <w:r>
-        <w:rPr>
-          <w:rFonts w:ascii="Times New Roman" w:hAnsi="Times New Roman" w:cs="Times New Roman"/>
-          <w:sz w:val="22"/>
-          <w:szCs w:val="22"/>
-        </w:rPr>
-        <w:t xml:space="preserve">, </w:t>
-      </w:r>
-      <w:proofErr w:type="spellStart"/>
-      <w:r>
-        <w:rPr>
-          <w:rFonts w:ascii="Times New Roman" w:hAnsi="Times New Roman" w:cs="Times New Roman"/>
-          <w:sz w:val="22"/>
-          <w:szCs w:val="22"/>
-        </w:rPr>
-        <w:t>readMore</w:t>
-      </w:r>
-      <w:proofErr w:type="spellEnd"/>
-      <w:r>
-        <w:rPr>
-          <w:rFonts w:ascii="Times New Roman" w:hAnsi="Times New Roman" w:cs="Times New Roman"/>
-          <w:sz w:val="22"/>
-          <w:szCs w:val="22"/>
-        </w:rPr>
-        <w:t>).</w:t>
+        <w:t>2. The event calls clickAndShow(fullTxt, readMore).</w:t>
       </w:r>
     </w:p>
     <w:p>
@@ -1565,25 +1421,7 @@
           <w:sz w:val="22"/>
           <w:szCs w:val="22"/>
         </w:rPr>
-        <w:t xml:space="preserve">5. The </w:t>
-      </w:r>
-      <w:proofErr w:type="spellStart"/>
-      <w:r>
-        <w:rPr>
-          <w:rFonts w:ascii="Times New Roman" w:hAnsi="Times New Roman" w:cs="Times New Roman"/>
-          <w:sz w:val="22"/>
-          <w:szCs w:val="22"/>
-        </w:rPr>
-        <w:t>readMore</w:t>
-      </w:r>
-      <w:proofErr w:type="spellEnd"/>
-      <w:r>
-        <w:rPr>
-          <w:rFonts w:ascii="Times New Roman" w:hAnsi="Times New Roman" w:cs="Times New Roman"/>
-          <w:sz w:val="22"/>
-          <w:szCs w:val="22"/>
-        </w:rPr>
-        <w:t xml:space="preserve"> button is hidden by setting its display to "none".</w:t>
+        <w:t>5. The readMore button is hidden by setting its display to "none".</w:t>
       </w:r>
     </w:p>
     <w:p>
@@ -1888,7 +1726,6 @@
                 <w:szCs w:val="20"/>
               </w:rPr>
             </w:pPr>
-            <w:proofErr w:type="spellStart"/>
             <w:r>
               <w:rPr>
                 <w:rFonts w:ascii="Times New Roman" w:hAnsi="Times New Roman" w:cs="Times New Roman"/>
@@ -1897,7 +1734,6 @@
               </w:rPr>
               <w:t>isName</w:t>
             </w:r>
-            <w:proofErr w:type="spellEnd"/>
           </w:p>
         </w:tc>
       </w:tr>
@@ -1955,25 +1791,7 @@
                 <w:sz w:val="20"/>
                 <w:szCs w:val="20"/>
               </w:rPr>
-              <w:t xml:space="preserve">Must not be empty, must begin with a letter, match </w:t>
-            </w:r>
-            <w:proofErr w:type="spellStart"/>
-            <w:r>
-              <w:rPr>
-                <w:rFonts w:ascii="Times New Roman" w:hAnsi="Times New Roman" w:cs="Times New Roman"/>
-                <w:sz w:val="20"/>
-                <w:szCs w:val="20"/>
-              </w:rPr>
-              <w:t>emailRegex</w:t>
-            </w:r>
-            <w:proofErr w:type="spellEnd"/>
-            <w:r>
-              <w:rPr>
-                <w:rFonts w:ascii="Times New Roman" w:hAnsi="Times New Roman" w:cs="Times New Roman"/>
-                <w:sz w:val="20"/>
-                <w:szCs w:val="20"/>
-              </w:rPr>
-              <w:t>, and contain more than eight characters.</w:t>
+              <w:t>Must not be empty, must begin with a letter, match emailRegex, and contain more than eight characters.</w:t>
             </w:r>
           </w:p>
         </w:tc>
@@ -1992,7 +1810,6 @@
                 <w:szCs w:val="20"/>
               </w:rPr>
             </w:pPr>
-            <w:proofErr w:type="spellStart"/>
             <w:r>
               <w:rPr>
                 <w:rFonts w:ascii="Times New Roman" w:hAnsi="Times New Roman" w:cs="Times New Roman"/>
@@ -2001,7 +1818,6 @@
               </w:rPr>
               <w:t>isEmail</w:t>
             </w:r>
-            <w:proofErr w:type="spellEnd"/>
           </w:p>
         </w:tc>
       </w:tr>
@@ -2078,7 +1894,6 @@
                 <w:szCs w:val="20"/>
               </w:rPr>
             </w:pPr>
-            <w:proofErr w:type="spellStart"/>
             <w:r>
               <w:rPr>
                 <w:rFonts w:ascii="Times New Roman" w:hAnsi="Times New Roman" w:cs="Times New Roman"/>
@@ -2087,7 +1902,6 @@
               </w:rPr>
               <w:t>isMessage</w:t>
             </w:r>
-            <w:proofErr w:type="spellEnd"/>
           </w:p>
         </w:tc>
       </w:tr>
@@ -2143,61 +1957,7 @@
           <w:sz w:val="22"/>
           <w:szCs w:val="22"/>
         </w:rPr>
-        <w:t xml:space="preserve">Main function and event: A click listener on </w:t>
-      </w:r>
-      <w:proofErr w:type="spellStart"/>
-      <w:r>
-        <w:rPr>
-          <w:rFonts w:ascii="Times New Roman" w:hAnsi="Times New Roman" w:cs="Times New Roman"/>
-          <w:sz w:val="22"/>
-          <w:szCs w:val="22"/>
-        </w:rPr>
-        <w:t>subjectInput</w:t>
-      </w:r>
-      <w:proofErr w:type="spellEnd"/>
-      <w:r>
-        <w:rPr>
-          <w:rFonts w:ascii="Times New Roman" w:hAnsi="Times New Roman" w:cs="Times New Roman"/>
-          <w:sz w:val="22"/>
-          <w:szCs w:val="22"/>
-        </w:rPr>
-        <w:t xml:space="preserve"> reads the selected value and uses </w:t>
-      </w:r>
-      <w:proofErr w:type="spellStart"/>
-      <w:r>
-        <w:rPr>
-          <w:rFonts w:ascii="Times New Roman" w:hAnsi="Times New Roman" w:cs="Times New Roman"/>
-          <w:sz w:val="22"/>
-          <w:szCs w:val="22"/>
-        </w:rPr>
-        <w:t>subjectSelected</w:t>
-      </w:r>
-      <w:proofErr w:type="spellEnd"/>
-      <w:r>
-        <w:rPr>
-          <w:rFonts w:ascii="Times New Roman" w:hAnsi="Times New Roman" w:cs="Times New Roman"/>
-          <w:sz w:val="22"/>
-          <w:szCs w:val="22"/>
-        </w:rPr>
-        <w:t xml:space="preserve"> to determine how to handle it. A selection applies the is-selected class, green styling, and sets </w:t>
-      </w:r>
-      <w:proofErr w:type="spellStart"/>
-      <w:r>
-        <w:rPr>
-          <w:rFonts w:ascii="Times New Roman" w:hAnsi="Times New Roman" w:cs="Times New Roman"/>
-          <w:sz w:val="22"/>
-          <w:szCs w:val="22"/>
-        </w:rPr>
-        <w:t>isSubject</w:t>
-      </w:r>
-      <w:proofErr w:type="spellEnd"/>
-      <w:r>
-        <w:rPr>
-          <w:rFonts w:ascii="Times New Roman" w:hAnsi="Times New Roman" w:cs="Times New Roman"/>
-          <w:sz w:val="22"/>
-          <w:szCs w:val="22"/>
-        </w:rPr>
-        <w:t xml:space="preserve"> to true; an empty selection triggers an error and red styling.</w:t>
+        <w:t>Main function and event: A click listener on subjectInput reads the selected value and uses subjectSelected to determine how to handle it. A selection applies the is-selected class, green styling, and sets isSubject to true; an empty selection triggers an error and red styling.</w:t>
       </w:r>
     </w:p>
     <w:p>
@@ -2215,61 +1975,7 @@
           <w:sz w:val="22"/>
           <w:szCs w:val="22"/>
         </w:rPr>
-        <w:t xml:space="preserve">Difference and limitation: Subject validation runs on clicks and checks a selection, unlike the text fields, which validate while the user types. Also, </w:t>
-      </w:r>
-      <w:proofErr w:type="spellStart"/>
-      <w:r>
-        <w:rPr>
-          <w:rFonts w:ascii="Times New Roman" w:hAnsi="Times New Roman" w:cs="Times New Roman"/>
-          <w:sz w:val="22"/>
-          <w:szCs w:val="22"/>
-        </w:rPr>
-        <w:t>subjectValue</w:t>
-      </w:r>
-      <w:proofErr w:type="spellEnd"/>
-      <w:r>
-        <w:rPr>
-          <w:rFonts w:ascii="Times New Roman" w:hAnsi="Times New Roman" w:cs="Times New Roman"/>
-          <w:sz w:val="22"/>
-          <w:szCs w:val="22"/>
-        </w:rPr>
-        <w:t xml:space="preserve"> is a string, so checking </w:t>
-      </w:r>
-      <w:proofErr w:type="spellStart"/>
-      <w:r>
-        <w:rPr>
-          <w:rFonts w:ascii="Times New Roman" w:hAnsi="Times New Roman" w:cs="Times New Roman"/>
-          <w:sz w:val="22"/>
-          <w:szCs w:val="22"/>
-        </w:rPr>
-        <w:t>subjectValue.value</w:t>
-      </w:r>
-      <w:proofErr w:type="spellEnd"/>
-      <w:r>
-        <w:rPr>
-          <w:rFonts w:ascii="Times New Roman" w:hAnsi="Times New Roman" w:cs="Times New Roman"/>
-          <w:sz w:val="22"/>
-          <w:szCs w:val="22"/>
-        </w:rPr>
-        <w:t xml:space="preserve"> == "" will not reliably detect an empty value. The </w:t>
-      </w:r>
-      <w:proofErr w:type="spellStart"/>
-      <w:r>
-        <w:rPr>
-          <w:rFonts w:ascii="Times New Roman" w:hAnsi="Times New Roman" w:cs="Times New Roman"/>
-          <w:sz w:val="22"/>
-          <w:szCs w:val="22"/>
-        </w:rPr>
-        <w:t>subjectSelected</w:t>
-      </w:r>
-      <w:proofErr w:type="spellEnd"/>
-      <w:r>
-        <w:rPr>
-          <w:rFonts w:ascii="Times New Roman" w:hAnsi="Times New Roman" w:cs="Times New Roman"/>
-          <w:sz w:val="22"/>
-          <w:szCs w:val="22"/>
-        </w:rPr>
-        <w:t xml:space="preserve"> state also makes the result depend on the sequence of clicks.</w:t>
+        <w:t>Difference and limitation: Subject validation runs on clicks and checks a selection, unlike the text fields, which validate while the user types. Also, subjectValue is a string, so checking subjectValue.value == "" will not reliably detect an empty value. The subjectSelected state also makes the result depend on the sequence of clicks.</w:t>
       </w:r>
     </w:p>
     <w:p>
@@ -2360,25 +2066,7 @@
           <w:sz w:val="22"/>
           <w:szCs w:val="22"/>
         </w:rPr>
-        <w:t xml:space="preserve">1. </w:t>
-      </w:r>
-      <w:proofErr w:type="spellStart"/>
-      <w:r>
-        <w:rPr>
-          <w:rFonts w:ascii="Times New Roman" w:hAnsi="Times New Roman" w:cs="Times New Roman"/>
-          <w:sz w:val="22"/>
-          <w:szCs w:val="22"/>
-        </w:rPr>
-        <w:t>e.preventDefault</w:t>
-      </w:r>
-      <w:proofErr w:type="spellEnd"/>
-      <w:r>
-        <w:rPr>
-          <w:rFonts w:ascii="Times New Roman" w:hAnsi="Times New Roman" w:cs="Times New Roman"/>
-          <w:sz w:val="22"/>
-          <w:szCs w:val="22"/>
-        </w:rPr>
-        <w:t>() stops the browser from submitting the form in its default way.</w:t>
+        <w:t>1. e.preventDefault() stops the browser from submitting the form in its default way.</w:t>
       </w:r>
     </w:p>
     <w:p>
@@ -2397,79 +2085,7 @@
           <w:sz w:val="22"/>
           <w:szCs w:val="22"/>
         </w:rPr>
-        <w:t xml:space="preserve">2. The code checks whether </w:t>
-      </w:r>
-      <w:proofErr w:type="spellStart"/>
-      <w:r>
-        <w:rPr>
-          <w:rFonts w:ascii="Times New Roman" w:hAnsi="Times New Roman" w:cs="Times New Roman"/>
-          <w:sz w:val="22"/>
-          <w:szCs w:val="22"/>
-        </w:rPr>
-        <w:t>isName</w:t>
-      </w:r>
-      <w:proofErr w:type="spellEnd"/>
-      <w:r>
-        <w:rPr>
-          <w:rFonts w:ascii="Times New Roman" w:hAnsi="Times New Roman" w:cs="Times New Roman"/>
-          <w:sz w:val="22"/>
-          <w:szCs w:val="22"/>
-        </w:rPr>
-        <w:t xml:space="preserve">, </w:t>
-      </w:r>
-      <w:proofErr w:type="spellStart"/>
-      <w:r>
-        <w:rPr>
-          <w:rFonts w:ascii="Times New Roman" w:hAnsi="Times New Roman" w:cs="Times New Roman"/>
-          <w:sz w:val="22"/>
-          <w:szCs w:val="22"/>
-        </w:rPr>
-        <w:t>isEmail</w:t>
-      </w:r>
-      <w:proofErr w:type="spellEnd"/>
-      <w:r>
-        <w:rPr>
-          <w:rFonts w:ascii="Times New Roman" w:hAnsi="Times New Roman" w:cs="Times New Roman"/>
-          <w:sz w:val="22"/>
-          <w:szCs w:val="22"/>
-        </w:rPr>
-        <w:t xml:space="preserve">, </w:t>
-      </w:r>
-      <w:proofErr w:type="spellStart"/>
-      <w:r>
-        <w:rPr>
-          <w:rFonts w:ascii="Times New Roman" w:hAnsi="Times New Roman" w:cs="Times New Roman"/>
-          <w:sz w:val="22"/>
-          <w:szCs w:val="22"/>
-        </w:rPr>
-        <w:t>isMessage</w:t>
-      </w:r>
-      <w:proofErr w:type="spellEnd"/>
-      <w:r>
-        <w:rPr>
-          <w:rFonts w:ascii="Times New Roman" w:hAnsi="Times New Roman" w:cs="Times New Roman"/>
-          <w:sz w:val="22"/>
-          <w:szCs w:val="22"/>
-        </w:rPr>
-        <w:t xml:space="preserve">, and </w:t>
-      </w:r>
-      <w:proofErr w:type="spellStart"/>
-      <w:r>
-        <w:rPr>
-          <w:rFonts w:ascii="Times New Roman" w:hAnsi="Times New Roman" w:cs="Times New Roman"/>
-          <w:sz w:val="22"/>
-          <w:szCs w:val="22"/>
-        </w:rPr>
-        <w:t>isSubject</w:t>
-      </w:r>
-      <w:proofErr w:type="spellEnd"/>
-      <w:r>
-        <w:rPr>
-          <w:rFonts w:ascii="Times New Roman" w:hAnsi="Times New Roman" w:cs="Times New Roman"/>
-          <w:sz w:val="22"/>
-          <w:szCs w:val="22"/>
-        </w:rPr>
-        <w:t xml:space="preserve"> are all true.</w:t>
+        <w:t>2. The code checks whether isName, isEmail, isMessage, and isSubject are all true.</w:t>
       </w:r>
     </w:p>
     <w:p>
@@ -2507,25 +2123,7 @@
           <w:sz w:val="22"/>
           <w:szCs w:val="22"/>
         </w:rPr>
-        <w:t xml:space="preserve">4. If all flags are true, </w:t>
-      </w:r>
-      <w:proofErr w:type="spellStart"/>
-      <w:r>
-        <w:rPr>
-          <w:rFonts w:ascii="Times New Roman" w:hAnsi="Times New Roman" w:cs="Times New Roman"/>
-          <w:sz w:val="22"/>
-          <w:szCs w:val="22"/>
-        </w:rPr>
-        <w:t>window.scrollTo</w:t>
-      </w:r>
-      <w:proofErr w:type="spellEnd"/>
-      <w:r>
-        <w:rPr>
-          <w:rFonts w:ascii="Times New Roman" w:hAnsi="Times New Roman" w:cs="Times New Roman"/>
-          <w:sz w:val="22"/>
-          <w:szCs w:val="22"/>
-        </w:rPr>
-        <w:t>(0, 0) scrolls the page to the top.</w:t>
+        <w:t>4. If all flags are true, window.scrollTo(0, 0) scrolls the page to the top.</w:t>
       </w:r>
     </w:p>
     <w:p>
@@ -2545,25 +2143,7 @@
           <w:szCs w:val="22"/>
         </w:rPr>
         <w:lastRenderedPageBreak/>
-        <w:t xml:space="preserve">5. The code displays the success message “Successfully </w:t>
-      </w:r>
-      <w:proofErr w:type="spellStart"/>
-      <w:r>
-        <w:rPr>
-          <w:rFonts w:ascii="Times New Roman" w:hAnsi="Times New Roman" w:cs="Times New Roman"/>
-          <w:sz w:val="22"/>
-          <w:szCs w:val="22"/>
-        </w:rPr>
-        <w:t>submited</w:t>
-      </w:r>
-      <w:proofErr w:type="spellEnd"/>
-      <w:r>
-        <w:rPr>
-          <w:rFonts w:ascii="Times New Roman" w:hAnsi="Times New Roman" w:cs="Times New Roman"/>
-          <w:sz w:val="22"/>
-          <w:szCs w:val="22"/>
-        </w:rPr>
-        <w:t>!” and adds a link back to index.html.</w:t>
+        <w:t>5. The code displays the success message “Successfully submited!” and adds a link back to index.html.</w:t>
       </w:r>
     </w:p>
     <w:p>
@@ -2582,25 +2162,7 @@
           <w:sz w:val="22"/>
           <w:szCs w:val="22"/>
         </w:rPr>
-        <w:t xml:space="preserve">6. The form is hidden using </w:t>
-      </w:r>
-      <w:proofErr w:type="spellStart"/>
-      <w:r>
-        <w:rPr>
-          <w:rFonts w:ascii="Times New Roman" w:hAnsi="Times New Roman" w:cs="Times New Roman"/>
-          <w:sz w:val="22"/>
-          <w:szCs w:val="22"/>
-        </w:rPr>
-        <w:t>form.style.display</w:t>
-      </w:r>
-      <w:proofErr w:type="spellEnd"/>
-      <w:r>
-        <w:rPr>
-          <w:rFonts w:ascii="Times New Roman" w:hAnsi="Times New Roman" w:cs="Times New Roman"/>
-          <w:sz w:val="22"/>
-          <w:szCs w:val="22"/>
-        </w:rPr>
-        <w:t xml:space="preserve"> = "none".</w:t>
+        <w:t>6. The form is hidden using form.style.display = "none".</w:t>
       </w:r>
     </w:p>
     <w:p>
@@ -2654,25 +2216,7 @@
           <w:sz w:val="22"/>
           <w:szCs w:val="22"/>
         </w:rPr>
-        <w:t xml:space="preserve">The </w:t>
-      </w:r>
-      <w:proofErr w:type="spellStart"/>
-      <w:r>
-        <w:rPr>
-          <w:rFonts w:ascii="Times New Roman" w:hAnsi="Times New Roman" w:cs="Times New Roman"/>
-          <w:sz w:val="22"/>
-          <w:szCs w:val="22"/>
-        </w:rPr>
-        <w:t>setTimeout</w:t>
-      </w:r>
-      <w:proofErr w:type="spellEnd"/>
-      <w:r>
-        <w:rPr>
-          <w:rFonts w:ascii="Times New Roman" w:hAnsi="Times New Roman" w:cs="Times New Roman"/>
-          <w:sz w:val="22"/>
-          <w:szCs w:val="22"/>
-        </w:rPr>
-        <w:t>() function schedules another update after four seconds.</w:t>
+        <w:t>The setTimeout() function schedules another update after four seconds.</w:t>
       </w:r>
     </w:p>
     <w:p>
@@ -2709,25 +2253,7 @@
           <w:sz w:val="22"/>
           <w:szCs w:val="22"/>
         </w:rPr>
-        <w:t xml:space="preserve">- Makes the form visible again using </w:t>
-      </w:r>
-      <w:proofErr w:type="spellStart"/>
-      <w:r>
-        <w:rPr>
-          <w:rFonts w:ascii="Times New Roman" w:hAnsi="Times New Roman" w:cs="Times New Roman"/>
-          <w:sz w:val="22"/>
-          <w:szCs w:val="22"/>
-        </w:rPr>
-        <w:t>form.style.display</w:t>
-      </w:r>
-      <w:proofErr w:type="spellEnd"/>
-      <w:r>
-        <w:rPr>
-          <w:rFonts w:ascii="Times New Roman" w:hAnsi="Times New Roman" w:cs="Times New Roman"/>
-          <w:sz w:val="22"/>
-          <w:szCs w:val="22"/>
-        </w:rPr>
-        <w:t xml:space="preserve"> = "flex".</w:t>
+        <w:t>- Makes the form visible again using form.style.display = "flex".</w:t>
       </w:r>
     </w:p>
     <w:p>
@@ -2892,23 +2418,13 @@
           <w:szCs w:val="22"/>
         </w:rPr>
       </w:pPr>
-      <w:proofErr w:type="spellStart"/>
-      <w:r>
-        <w:rPr>
-          <w:rFonts w:ascii="Times New Roman" w:hAnsi="Times New Roman" w:cs="Times New Roman"/>
-          <w:sz w:val="22"/>
-          <w:szCs w:val="22"/>
-        </w:rPr>
-        <w:t>setError</w:t>
-      </w:r>
-      <w:proofErr w:type="spellEnd"/>
-      <w:r>
-        <w:rPr>
-          <w:rFonts w:ascii="Times New Roman" w:hAnsi="Times New Roman" w:cs="Times New Roman"/>
-          <w:sz w:val="22"/>
-          <w:szCs w:val="22"/>
-        </w:rPr>
-        <w:t>(input, error, message)</w:t>
+      <w:r>
+        <w:rPr>
+          <w:rFonts w:ascii="Times New Roman" w:hAnsi="Times New Roman" w:cs="Times New Roman"/>
+          <w:sz w:val="22"/>
+          <w:szCs w:val="22"/>
+        </w:rPr>
+        <w:t>setError(input, error, message)</w:t>
       </w:r>
     </w:p>
     <w:p>
@@ -2946,25 +2462,7 @@
           <w:sz w:val="22"/>
           <w:szCs w:val="22"/>
         </w:rPr>
-        <w:t xml:space="preserve">- Sets </w:t>
-      </w:r>
-      <w:proofErr w:type="spellStart"/>
-      <w:r>
-        <w:rPr>
-          <w:rFonts w:ascii="Times New Roman" w:hAnsi="Times New Roman" w:cs="Times New Roman"/>
-          <w:sz w:val="22"/>
-          <w:szCs w:val="22"/>
-        </w:rPr>
-        <w:t>isValid</w:t>
-      </w:r>
-      <w:proofErr w:type="spellEnd"/>
-      <w:r>
-        <w:rPr>
-          <w:rFonts w:ascii="Times New Roman" w:hAnsi="Times New Roman" w:cs="Times New Roman"/>
-          <w:sz w:val="22"/>
-          <w:szCs w:val="22"/>
-        </w:rPr>
-        <w:t xml:space="preserve"> to false.</w:t>
+        <w:t>- Sets isValid to false.</w:t>
       </w:r>
     </w:p>
     <w:p>
@@ -2999,25 +2497,7 @@
           <w:sz w:val="22"/>
           <w:szCs w:val="22"/>
         </w:rPr>
-        <w:t xml:space="preserve"> invalid field in </w:t>
-      </w:r>
-      <w:proofErr w:type="spellStart"/>
-      <w:r>
-        <w:rPr>
-          <w:rFonts w:ascii="Times New Roman" w:hAnsi="Times New Roman" w:cs="Times New Roman"/>
-          <w:sz w:val="22"/>
-          <w:szCs w:val="22"/>
-        </w:rPr>
-        <w:t>invalidField</w:t>
-      </w:r>
-      <w:proofErr w:type="spellEnd"/>
-      <w:r>
-        <w:rPr>
-          <w:rFonts w:ascii="Times New Roman" w:hAnsi="Times New Roman" w:cs="Times New Roman"/>
-          <w:sz w:val="22"/>
-          <w:szCs w:val="22"/>
-        </w:rPr>
-        <w:t>, if one has not already been saved.</w:t>
+        <w:t xml:space="preserve"> invalid field in invalidField, if one has not already been saved.</w:t>
       </w:r>
     </w:p>
     <w:p>
@@ -3055,25 +2535,7 @@
           <w:sz w:val="22"/>
           <w:szCs w:val="22"/>
         </w:rPr>
-        <w:t>- Connects the input to its error message using aria-</w:t>
-      </w:r>
-      <w:proofErr w:type="spellStart"/>
-      <w:r>
-        <w:rPr>
-          <w:rFonts w:ascii="Times New Roman" w:hAnsi="Times New Roman" w:cs="Times New Roman"/>
-          <w:sz w:val="22"/>
-          <w:szCs w:val="22"/>
-        </w:rPr>
-        <w:t>describedby</w:t>
-      </w:r>
-      <w:proofErr w:type="spellEnd"/>
-      <w:r>
-        <w:rPr>
-          <w:rFonts w:ascii="Times New Roman" w:hAnsi="Times New Roman" w:cs="Times New Roman"/>
-          <w:sz w:val="22"/>
-          <w:szCs w:val="22"/>
-        </w:rPr>
-        <w:t>.</w:t>
+        <w:t>- Connects the input to its error message using aria-describedby.</w:t>
       </w:r>
     </w:p>
     <w:p>
@@ -3092,25 +2554,7 @@
           <w:sz w:val="22"/>
           <w:szCs w:val="22"/>
         </w:rPr>
-        <w:t xml:space="preserve">- Displays the provided error message using </w:t>
-      </w:r>
-      <w:proofErr w:type="spellStart"/>
-      <w:r>
-        <w:rPr>
-          <w:rFonts w:ascii="Times New Roman" w:hAnsi="Times New Roman" w:cs="Times New Roman"/>
-          <w:sz w:val="22"/>
-          <w:szCs w:val="22"/>
-        </w:rPr>
-        <w:t>error.textContent</w:t>
-      </w:r>
-      <w:proofErr w:type="spellEnd"/>
-      <w:r>
-        <w:rPr>
-          <w:rFonts w:ascii="Times New Roman" w:hAnsi="Times New Roman" w:cs="Times New Roman"/>
-          <w:sz w:val="22"/>
-          <w:szCs w:val="22"/>
-        </w:rPr>
-        <w:t>.</w:t>
+        <w:t>- Displays the provided error message using error.textContent.</w:t>
       </w:r>
     </w:p>
     <w:p>
@@ -3162,23 +2606,13 @@
           <w:szCs w:val="22"/>
         </w:rPr>
       </w:pPr>
-      <w:proofErr w:type="spellStart"/>
-      <w:r>
-        <w:rPr>
-          <w:rFonts w:ascii="Times New Roman" w:hAnsi="Times New Roman" w:cs="Times New Roman"/>
-          <w:sz w:val="22"/>
-          <w:szCs w:val="22"/>
-        </w:rPr>
-        <w:t>clearError</w:t>
-      </w:r>
-      <w:proofErr w:type="spellEnd"/>
-      <w:r>
-        <w:rPr>
-          <w:rFonts w:ascii="Times New Roman" w:hAnsi="Times New Roman" w:cs="Times New Roman"/>
-          <w:sz w:val="22"/>
-          <w:szCs w:val="22"/>
-        </w:rPr>
-        <w:t>(input, error)</w:t>
+      <w:r>
+        <w:rPr>
+          <w:rFonts w:ascii="Times New Roman" w:hAnsi="Times New Roman" w:cs="Times New Roman"/>
+          <w:sz w:val="22"/>
+          <w:szCs w:val="22"/>
+        </w:rPr>
+        <w:t>clearError(input, error)</w:t>
       </w:r>
     </w:p>
     <w:p>
@@ -3197,25 +2631,7 @@
           <w:sz w:val="22"/>
           <w:szCs w:val="22"/>
         </w:rPr>
-        <w:t>This function clears an error after the input becomes valid. It sets aria-invalid to "false", removes aria-</w:t>
-      </w:r>
-      <w:proofErr w:type="spellStart"/>
-      <w:r>
-        <w:rPr>
-          <w:rFonts w:ascii="Times New Roman" w:hAnsi="Times New Roman" w:cs="Times New Roman"/>
-          <w:sz w:val="22"/>
-          <w:szCs w:val="22"/>
-        </w:rPr>
-        <w:t>describedby</w:t>
-      </w:r>
-      <w:proofErr w:type="spellEnd"/>
-      <w:r>
-        <w:rPr>
-          <w:rFonts w:ascii="Times New Roman" w:hAnsi="Times New Roman" w:cs="Times New Roman"/>
-          <w:sz w:val="22"/>
-          <w:szCs w:val="22"/>
-        </w:rPr>
-        <w:t>, and empties the error message.</w:t>
+        <w:t>This function clears an error after the input becomes valid. It sets aria-invalid to "false", removes aria-describedby, and empties the error message.</w:t>
       </w:r>
     </w:p>
     <w:p>
@@ -3314,43 +2730,7 @@
           <w:sz w:val="22"/>
           <w:szCs w:val="22"/>
         </w:rPr>
-        <w:t xml:space="preserve">Main function: </w:t>
-      </w:r>
-      <w:proofErr w:type="spellStart"/>
-      <w:r>
-        <w:rPr>
-          <w:rFonts w:ascii="Times New Roman" w:hAnsi="Times New Roman" w:cs="Times New Roman"/>
-          <w:sz w:val="22"/>
-          <w:szCs w:val="22"/>
-        </w:rPr>
-        <w:t>calculateTotal</w:t>
-      </w:r>
-      <w:proofErr w:type="spellEnd"/>
-      <w:r>
-        <w:rPr>
-          <w:rFonts w:ascii="Times New Roman" w:hAnsi="Times New Roman" w:cs="Times New Roman"/>
-          <w:sz w:val="22"/>
-          <w:szCs w:val="22"/>
-        </w:rPr>
-        <w:t>(</w:t>
-      </w:r>
-      <w:proofErr w:type="spellStart"/>
-      <w:r>
-        <w:rPr>
-          <w:rFonts w:ascii="Times New Roman" w:hAnsi="Times New Roman" w:cs="Times New Roman"/>
-          <w:sz w:val="22"/>
-          <w:szCs w:val="22"/>
-        </w:rPr>
-        <w:t>arr</w:t>
-      </w:r>
-      <w:proofErr w:type="spellEnd"/>
-      <w:r>
-        <w:rPr>
-          <w:rFonts w:ascii="Times New Roman" w:hAnsi="Times New Roman" w:cs="Times New Roman"/>
-          <w:sz w:val="22"/>
-          <w:szCs w:val="22"/>
-        </w:rPr>
-        <w:t>)</w:t>
+        <w:t>Main function: calculateTotal(arr)</w:t>
       </w:r>
     </w:p>
     <w:p>
@@ -3424,43 +2804,7 @@
           <w:sz w:val="22"/>
           <w:szCs w:val="22"/>
         </w:rPr>
-        <w:t xml:space="preserve">2. The function </w:t>
-      </w:r>
-      <w:proofErr w:type="spellStart"/>
-      <w:r>
-        <w:rPr>
-          <w:rFonts w:ascii="Times New Roman" w:hAnsi="Times New Roman" w:cs="Times New Roman"/>
-          <w:sz w:val="22"/>
-          <w:szCs w:val="22"/>
-        </w:rPr>
-        <w:t>calculateTotal</w:t>
-      </w:r>
-      <w:proofErr w:type="spellEnd"/>
-      <w:r>
-        <w:rPr>
-          <w:rFonts w:ascii="Times New Roman" w:hAnsi="Times New Roman" w:cs="Times New Roman"/>
-          <w:sz w:val="22"/>
-          <w:szCs w:val="22"/>
-        </w:rPr>
-        <w:t>(</w:t>
-      </w:r>
-      <w:proofErr w:type="spellStart"/>
-      <w:r>
-        <w:rPr>
-          <w:rFonts w:ascii="Times New Roman" w:hAnsi="Times New Roman" w:cs="Times New Roman"/>
-          <w:sz w:val="22"/>
-          <w:szCs w:val="22"/>
-        </w:rPr>
-        <w:t>inputGroup</w:t>
-      </w:r>
-      <w:proofErr w:type="spellEnd"/>
-      <w:r>
-        <w:rPr>
-          <w:rFonts w:ascii="Times New Roman" w:hAnsi="Times New Roman" w:cs="Times New Roman"/>
-          <w:sz w:val="22"/>
-          <w:szCs w:val="22"/>
-        </w:rPr>
-        <w:t>) receives an array containing the name, email, and message inputs.</w:t>
+        <w:t>2. The function calculateTotal(inputGroup) receives an array containing the name, email, and message inputs.</w:t>
       </w:r>
     </w:p>
     <w:p>
@@ -3498,25 +2842,7 @@
           <w:sz w:val="22"/>
           <w:szCs w:val="22"/>
         </w:rPr>
-        <w:t xml:space="preserve">4. </w:t>
-      </w:r>
-      <w:proofErr w:type="spellStart"/>
-      <w:r>
-        <w:rPr>
-          <w:rFonts w:ascii="Times New Roman" w:hAnsi="Times New Roman" w:cs="Times New Roman"/>
-          <w:sz w:val="22"/>
-          <w:szCs w:val="22"/>
-        </w:rPr>
-        <w:t>liveCounter.textContent</w:t>
-      </w:r>
-      <w:proofErr w:type="spellEnd"/>
-      <w:r>
-        <w:rPr>
-          <w:rFonts w:ascii="Times New Roman" w:hAnsi="Times New Roman" w:cs="Times New Roman"/>
-          <w:sz w:val="22"/>
-          <w:szCs w:val="22"/>
-        </w:rPr>
-        <w:t xml:space="preserve"> updates the displayed character count.</w:t>
+        <w:t>4. liveCounter.textContent updates the displayed character count.</w:t>
       </w:r>
     </w:p>
     <w:p>
@@ -3877,44 +3203,15 @@
         <w:lastRenderedPageBreak/>
         <w:t>I researched different functions which could aid to my problem and after a short time I came across the “</w:t>
       </w:r>
-      <w:proofErr w:type="spellStart"/>
-      <w:r>
-        <w:rPr>
-          <w:rFonts w:ascii="Times New Roman" w:hAnsi="Times New Roman" w:cs="Times New Roman"/>
-        </w:rPr>
-        <w:fldChar w:fldCharType="begin"/>
-      </w:r>
-      <w:r>
-        <w:rPr>
-          <w:rFonts w:ascii="Times New Roman" w:hAnsi="Times New Roman" w:cs="Times New Roman"/>
-        </w:rPr>
-        <w:instrText>HYPERLINK "https://developer.mozilla.org/es/docs/Web/API/Element/insertAdjacentHTML"</w:instrText>
-      </w:r>
-      <w:r>
-        <w:rPr>
-          <w:rFonts w:ascii="Times New Roman" w:hAnsi="Times New Roman" w:cs="Times New Roman"/>
-        </w:rPr>
-      </w:r>
-      <w:r>
-        <w:rPr>
-          <w:rFonts w:ascii="Times New Roman" w:hAnsi="Times New Roman" w:cs="Times New Roman"/>
-        </w:rPr>
-        <w:fldChar w:fldCharType="separate"/>
-      </w:r>
-      <w:r>
-        <w:rPr>
-          <w:rStyle w:val="Hyperlink"/>
-          <w:rFonts w:ascii="Times New Roman" w:hAnsi="Times New Roman" w:cs="Times New Roman"/>
-        </w:rPr>
-        <w:t>insertAdjacentHTML</w:t>
-      </w:r>
-      <w:proofErr w:type="spellEnd"/>
-      <w:r>
-        <w:rPr>
-          <w:rFonts w:ascii="Times New Roman" w:hAnsi="Times New Roman" w:cs="Times New Roman"/>
-        </w:rPr>
-        <w:fldChar w:fldCharType="end"/>
-      </w:r>
+      <w:hyperlink r:id="rId20" w:history="1">
+        <w:r>
+          <w:rPr>
+            <w:rStyle w:val="Hyperlink"/>
+            <w:rFonts w:ascii="Times New Roman" w:hAnsi="Times New Roman" w:cs="Times New Roman"/>
+          </w:rPr>
+          <w:t>insertAdjacentHTML</w:t>
+        </w:r>
+      </w:hyperlink>
       <w:r>
         <w:rPr>
           <w:rFonts w:ascii="Times New Roman" w:hAnsi="Times New Roman" w:cs="Times New Roman"/>
@@ -4163,23 +3460,13 @@
                 <w:szCs w:val="20"/>
               </w:rPr>
             </w:pPr>
-            <w:proofErr w:type="spellStart"/>
             <w:r>
               <w:rPr>
                 <w:rFonts w:ascii="Times New Roman" w:hAnsi="Times New Roman" w:cs="Times New Roman"/>
                 <w:sz w:val="20"/>
                 <w:szCs w:val="20"/>
               </w:rPr>
-              <w:t>clickAndShow</w:t>
-            </w:r>
-            <w:proofErr w:type="spellEnd"/>
-            <w:r>
-              <w:rPr>
-                <w:rFonts w:ascii="Times New Roman" w:hAnsi="Times New Roman" w:cs="Times New Roman"/>
-                <w:sz w:val="20"/>
-                <w:szCs w:val="20"/>
-              </w:rPr>
-              <w:t>()</w:t>
+              <w:t>clickAndShow()</w:t>
             </w:r>
           </w:p>
         </w:tc>
@@ -4276,23 +3563,13 @@
                 <w:szCs w:val="20"/>
               </w:rPr>
             </w:pPr>
-            <w:proofErr w:type="spellStart"/>
             <w:r>
               <w:rPr>
                 <w:rFonts w:ascii="Times New Roman" w:hAnsi="Times New Roman" w:cs="Times New Roman"/>
                 <w:sz w:val="20"/>
                 <w:szCs w:val="20"/>
               </w:rPr>
-              <w:t>calculateTotal</w:t>
-            </w:r>
-            <w:proofErr w:type="spellEnd"/>
-            <w:r>
-              <w:rPr>
-                <w:rFonts w:ascii="Times New Roman" w:hAnsi="Times New Roman" w:cs="Times New Roman"/>
-                <w:sz w:val="20"/>
-                <w:szCs w:val="20"/>
-              </w:rPr>
-              <w:t>()</w:t>
+              <w:t>calculateTotal()</w:t>
             </w:r>
           </w:p>
         </w:tc>
@@ -4413,23 +3690,13 @@
                 <w:szCs w:val="20"/>
               </w:rPr>
             </w:pPr>
-            <w:proofErr w:type="spellStart"/>
             <w:r>
               <w:rPr>
                 <w:rFonts w:ascii="Times New Roman" w:hAnsi="Times New Roman" w:cs="Times New Roman"/>
                 <w:sz w:val="20"/>
                 <w:szCs w:val="20"/>
               </w:rPr>
-              <w:t>setError</w:t>
-            </w:r>
-            <w:proofErr w:type="spellEnd"/>
-            <w:r>
-              <w:rPr>
-                <w:rFonts w:ascii="Times New Roman" w:hAnsi="Times New Roman" w:cs="Times New Roman"/>
-                <w:sz w:val="20"/>
-                <w:szCs w:val="20"/>
-              </w:rPr>
-              <w:t>()</w:t>
+              <w:t>setError()</w:t>
             </w:r>
           </w:p>
           <w:p>
@@ -4441,23 +3708,13 @@
                 <w:szCs w:val="20"/>
               </w:rPr>
             </w:pPr>
-            <w:proofErr w:type="spellStart"/>
             <w:r>
               <w:rPr>
                 <w:rFonts w:ascii="Times New Roman" w:hAnsi="Times New Roman" w:cs="Times New Roman"/>
                 <w:sz w:val="20"/>
                 <w:szCs w:val="20"/>
               </w:rPr>
-              <w:t>clearError</w:t>
-            </w:r>
-            <w:proofErr w:type="spellEnd"/>
-            <w:r>
-              <w:rPr>
-                <w:rFonts w:ascii="Times New Roman" w:hAnsi="Times New Roman" w:cs="Times New Roman"/>
-                <w:sz w:val="20"/>
-                <w:szCs w:val="20"/>
-              </w:rPr>
-              <w:t>()</w:t>
+              <w:t>clearError()</w:t>
             </w:r>
           </w:p>
         </w:tc>
@@ -4771,23 +4028,13 @@
                 <w:szCs w:val="20"/>
               </w:rPr>
             </w:pPr>
-            <w:proofErr w:type="gramStart"/>
             <w:r>
               <w:rPr>
                 <w:rFonts w:ascii="Times New Roman" w:hAnsi="Times New Roman" w:cs="Times New Roman"/>
                 <w:sz w:val="20"/>
                 <w:szCs w:val="20"/>
               </w:rPr>
-              <w:t>Subject</w:t>
-            </w:r>
-            <w:proofErr w:type="gramEnd"/>
-            <w:r>
-              <w:rPr>
-                <w:rFonts w:ascii="Times New Roman" w:hAnsi="Times New Roman" w:cs="Times New Roman"/>
-                <w:sz w:val="20"/>
-                <w:szCs w:val="20"/>
-              </w:rPr>
-              <w:t xml:space="preserve"> click</w:t>
+              <w:t>Subject click</w:t>
             </w:r>
           </w:p>
         </w:tc>
@@ -5019,25 +4266,7 @@
                 <w:sz w:val="20"/>
                 <w:szCs w:val="20"/>
               </w:rPr>
-              <w:t xml:space="preserve">Callback inside </w:t>
-            </w:r>
-            <w:proofErr w:type="spellStart"/>
-            <w:r>
-              <w:rPr>
-                <w:rFonts w:ascii="Times New Roman" w:hAnsi="Times New Roman" w:cs="Times New Roman"/>
-                <w:sz w:val="20"/>
-                <w:szCs w:val="20"/>
-              </w:rPr>
-              <w:t>setTimeout</w:t>
-            </w:r>
-            <w:proofErr w:type="spellEnd"/>
-            <w:r>
-              <w:rPr>
-                <w:rFonts w:ascii="Times New Roman" w:hAnsi="Times New Roman" w:cs="Times New Roman"/>
-                <w:sz w:val="20"/>
-                <w:szCs w:val="20"/>
-              </w:rPr>
-              <w:t>()</w:t>
+              <w:t>Callback inside setTimeout()</w:t>
             </w:r>
           </w:p>
         </w:tc>
@@ -5168,11 +4397,60 @@
           <w:rFonts w:ascii="Times New Roman" w:hAnsi="Times New Roman" w:cs="Times New Roman"/>
         </w:rPr>
       </w:pPr>
-      <w:r>
-        <w:rPr>
-          <w:rFonts w:ascii="Times New Roman" w:hAnsi="Times New Roman" w:cs="Times New Roman"/>
-        </w:rPr>
-        <w:t>Debugging:</w:t>
+    </w:p>
+    <w:p>
+      <w:pPr>
+        <w:rPr>
+          <w:rFonts w:ascii="Times New Roman" w:hAnsi="Times New Roman" w:cs="Times New Roman"/>
+        </w:rPr>
+      </w:pPr>
+    </w:p>
+    <w:p>
+      <w:pPr>
+        <w:rPr>
+          <w:rFonts w:ascii="Times New Roman" w:hAnsi="Times New Roman" w:cs="Times New Roman"/>
+        </w:rPr>
+      </w:pPr>
+    </w:p>
+    <w:p>
+      <w:pPr>
+        <w:rPr>
+          <w:rFonts w:ascii="Times New Roman" w:hAnsi="Times New Roman" w:cs="Times New Roman"/>
+        </w:rPr>
+      </w:pPr>
+    </w:p>
+    <w:p>
+      <w:pPr>
+        <w:rPr>
+          <w:rFonts w:ascii="Times New Roman" w:hAnsi="Times New Roman" w:cs="Times New Roman"/>
+          <w:b/>
+          <w:bCs/>
+        </w:rPr>
+      </w:pPr>
+      <w:r>
+        <w:rPr>
+          <w:rFonts w:ascii="Times New Roman" w:hAnsi="Times New Roman" w:cs="Times New Roman"/>
+          <w:b/>
+          <w:bCs/>
+        </w:rPr>
+        <w:lastRenderedPageBreak/>
+        <w:t>Debugging</w:t>
+      </w:r>
+      <w:r>
+        <w:rPr>
+          <w:rFonts w:ascii="Times New Roman" w:hAnsi="Times New Roman" w:cs="Times New Roman"/>
+          <w:b/>
+          <w:bCs/>
+        </w:rPr>
+        <w:t xml:space="preserve"> evidence</w:t>
+      </w:r>
+      <w:r>
+        <w:rPr>
+          <w:rFonts w:ascii="Times New Roman" w:hAnsi="Times New Roman" w:cs="Times New Roman"/>
+          <w:b/>
+          <w:bCs/>
+        </w:rPr>
+        <w:t>:</w:t>
       </w:r>
     </w:p>
     <w:p>
@@ -5271,7 +4549,6 @@
           <w:rFonts w:ascii="Times New Roman" w:hAnsi="Times New Roman" w:cs="Times New Roman"/>
           <w:noProof/>
         </w:rPr>
-        <w:lastRenderedPageBreak/>
         <w:drawing>
           <wp:inline distT="0" distB="0" distL="0" distR="0" wp14:anchorId="2860633E" wp14:editId="2F9A1FEA">
             <wp:extent cx="5731510" cy="3095625"/>
@@ -5288,7 +4565,7 @@
                     <pic:cNvPicPr/>
                   </pic:nvPicPr>
                   <pic:blipFill>
-                    <a:blip r:embed="rId20"/>
+                    <a:blip r:embed="rId21"/>
                     <a:stretch>
                       <a:fillRect/>
                     </a:stretch>
@@ -5319,35 +4596,416 @@
         <w:rPr>
           <w:rFonts w:ascii="Times New Roman" w:hAnsi="Times New Roman" w:cs="Times New Roman"/>
         </w:rPr>
-        <w:t xml:space="preserve">I misspelled the function, after correcting </w:t>
-      </w:r>
-      <w:proofErr w:type="spellStart"/>
-      <w:r>
-        <w:rPr>
-          <w:rFonts w:ascii="Times New Roman" w:hAnsi="Times New Roman" w:cs="Times New Roman"/>
-        </w:rPr>
-        <w:t>input.setAttibute</w:t>
-      </w:r>
-      <w:proofErr w:type="spellEnd"/>
-      <w:r>
-        <w:rPr>
-          <w:rFonts w:ascii="Times New Roman" w:hAnsi="Times New Roman" w:cs="Times New Roman"/>
-        </w:rPr>
-        <w:t xml:space="preserve"> to </w:t>
-      </w:r>
-      <w:proofErr w:type="spellStart"/>
-      <w:r>
-        <w:rPr>
-          <w:rFonts w:ascii="Times New Roman" w:hAnsi="Times New Roman" w:cs="Times New Roman"/>
-        </w:rPr>
-        <w:t>input.setAttribute</w:t>
-      </w:r>
-      <w:proofErr w:type="spellEnd"/>
-      <w:r>
-        <w:rPr>
-          <w:rFonts w:ascii="Times New Roman" w:hAnsi="Times New Roman" w:cs="Times New Roman"/>
-        </w:rPr>
-        <w:t xml:space="preserve"> things worked as supposed to.</w:t>
+        <w:t>I misspelled the function, after correcting input.setAttibute to input.setAttribute things worked as supposed to.</w:t>
+      </w:r>
+    </w:p>
+    <w:p>
+      <w:pPr>
+        <w:rPr>
+          <w:rFonts w:ascii="Times New Roman" w:hAnsi="Times New Roman" w:cs="Times New Roman"/>
+        </w:rPr>
+      </w:pPr>
+    </w:p>
+    <w:p>
+      <w:pPr>
+        <w:rPr>
+          <w:rFonts w:ascii="Times New Roman" w:hAnsi="Times New Roman" w:cs="Times New Roman"/>
+          <w:b/>
+          <w:bCs/>
+        </w:rPr>
+      </w:pPr>
+      <w:r>
+        <w:rPr>
+          <w:rFonts w:ascii="Times New Roman" w:hAnsi="Times New Roman" w:cs="Times New Roman"/>
+          <w:b/>
+          <w:bCs/>
+        </w:rPr>
+        <w:t>Filter and sort together:</w:t>
+      </w:r>
+    </w:p>
+    <w:p>
+      <w:pPr>
+        <w:pStyle w:val="ListParagraph"/>
+        <w:numPr>
+          <w:ilvl w:val="0"/>
+          <w:numId w:val="5"/>
+        </w:numPr>
+        <w:rPr>
+          <w:rFonts w:ascii="Times New Roman" w:hAnsi="Times New Roman" w:cs="Times New Roman"/>
+        </w:rPr>
+      </w:pPr>
+      <w:r>
+        <w:rPr>
+          <w:rFonts w:ascii="Times New Roman" w:hAnsi="Times New Roman" w:cs="Times New Roman"/>
+        </w:rPr>
+        <w:t>Normal:</w:t>
+      </w:r>
+    </w:p>
+    <w:p>
+      <w:pPr>
+        <w:jc w:val="center"/>
+        <w:rPr>
+          <w:rFonts w:ascii="Times New Roman" w:hAnsi="Times New Roman" w:cs="Times New Roman"/>
+        </w:rPr>
+      </w:pPr>
+      <w:r>
+        <w:rPr>
+          <w:rFonts w:ascii="Times New Roman" w:hAnsi="Times New Roman" w:cs="Times New Roman"/>
+        </w:rPr>
+        <w:drawing>
+          <wp:inline distT="0" distB="0" distL="0" distR="0" wp14:anchorId="6703B7E3" wp14:editId="7875B407">
+            <wp:extent cx="5048250" cy="2011338"/>
+            <wp:effectExtent l="0" t="0" r="0" b="8255"/>
+            <wp:docPr id="83276880" name="Picture 1"/>
+            <wp:cNvGraphicFramePr>
+              <a:graphicFrameLocks xmlns:a="http://schemas.openxmlformats.org/drawingml/2006/main" noChangeAspect="1"/>
+            </wp:cNvGraphicFramePr>
+            <a:graphic xmlns:a="http://schemas.openxmlformats.org/drawingml/2006/main">
+              <a:graphicData uri="http://schemas.openxmlformats.org/drawingml/2006/picture">
+                <pic:pic xmlns:pic="http://schemas.openxmlformats.org/drawingml/2006/picture">
+                  <pic:nvPicPr>
+                    <pic:cNvPr id="83276880" name=""/>
+                    <pic:cNvPicPr/>
+                  </pic:nvPicPr>
+                  <pic:blipFill>
+                    <a:blip r:embed="rId22"/>
+                    <a:stretch>
+                      <a:fillRect/>
+                    </a:stretch>
+                  </pic:blipFill>
+                  <pic:spPr>
+                    <a:xfrm>
+                      <a:off x="0" y="0"/>
+                      <a:ext cx="5064163" cy="2017678"/>
+                    </a:xfrm>
+                    <a:prstGeom prst="rect">
+                      <a:avLst/>
+                    </a:prstGeom>
+                  </pic:spPr>
+                </pic:pic>
+              </a:graphicData>
+            </a:graphic>
+          </wp:inline>
+        </w:drawing>
+      </w:r>
+    </w:p>
+    <w:p>
+      <w:pPr>
+        <w:pStyle w:val="ListParagraph"/>
+        <w:numPr>
+          <w:ilvl w:val="0"/>
+          <w:numId w:val="5"/>
+        </w:numPr>
+        <w:rPr>
+          <w:rFonts w:ascii="Times New Roman" w:hAnsi="Times New Roman" w:cs="Times New Roman"/>
+        </w:rPr>
+      </w:pPr>
+      <w:r>
+        <w:rPr>
+          <w:rFonts w:ascii="Times New Roman" w:hAnsi="Times New Roman" w:cs="Times New Roman"/>
+        </w:rPr>
+        <w:t>Filtered:</w:t>
+      </w:r>
+    </w:p>
+    <w:p>
+      <w:pPr>
+        <w:jc w:val="center"/>
+        <w:rPr>
+          <w:rFonts w:ascii="Times New Roman" w:hAnsi="Times New Roman" w:cs="Times New Roman"/>
+        </w:rPr>
+      </w:pPr>
+      <w:r>
+        <w:rPr>
+          <w:rFonts w:ascii="Times New Roman" w:hAnsi="Times New Roman" w:cs="Times New Roman"/>
+        </w:rPr>
+        <w:drawing>
+          <wp:inline distT="0" distB="0" distL="0" distR="0" wp14:anchorId="7B6C04FE" wp14:editId="43B5D19E">
+            <wp:extent cx="5133975" cy="1594846"/>
+            <wp:effectExtent l="0" t="0" r="0" b="5715"/>
+            <wp:docPr id="555991257" name="Picture 1"/>
+            <wp:cNvGraphicFramePr>
+              <a:graphicFrameLocks xmlns:a="http://schemas.openxmlformats.org/drawingml/2006/main" noChangeAspect="1"/>
+            </wp:cNvGraphicFramePr>
+            <a:graphic xmlns:a="http://schemas.openxmlformats.org/drawingml/2006/main">
+              <a:graphicData uri="http://schemas.openxmlformats.org/drawingml/2006/picture">
+                <pic:pic xmlns:pic="http://schemas.openxmlformats.org/drawingml/2006/picture">
+                  <pic:nvPicPr>
+                    <pic:cNvPr id="555991257" name=""/>
+                    <pic:cNvPicPr/>
+                  </pic:nvPicPr>
+                  <pic:blipFill>
+                    <a:blip r:embed="rId23"/>
+                    <a:stretch>
+                      <a:fillRect/>
+                    </a:stretch>
+                  </pic:blipFill>
+                  <pic:spPr>
+                    <a:xfrm>
+                      <a:off x="0" y="0"/>
+                      <a:ext cx="5172365" cy="1606772"/>
+                    </a:xfrm>
+                    <a:prstGeom prst="rect">
+                      <a:avLst/>
+                    </a:prstGeom>
+                  </pic:spPr>
+                </pic:pic>
+              </a:graphicData>
+            </a:graphic>
+          </wp:inline>
+        </w:drawing>
+      </w:r>
+    </w:p>
+    <w:p>
+      <w:pPr>
+        <w:pStyle w:val="ListParagraph"/>
+        <w:numPr>
+          <w:ilvl w:val="0"/>
+          <w:numId w:val="5"/>
+        </w:numPr>
+        <w:rPr>
+          <w:rFonts w:ascii="Times New Roman" w:hAnsi="Times New Roman" w:cs="Times New Roman"/>
+        </w:rPr>
+      </w:pPr>
+      <w:r>
+        <w:rPr>
+          <w:rFonts w:ascii="Times New Roman" w:hAnsi="Times New Roman" w:cs="Times New Roman"/>
+        </w:rPr>
+        <w:lastRenderedPageBreak/>
+        <w:t>Sorted &amp; Filtered</w:t>
+      </w:r>
+    </w:p>
+    <w:p>
+      <w:pPr>
+        <w:jc w:val="center"/>
+        <w:rPr>
+          <w:rFonts w:ascii="Times New Roman" w:hAnsi="Times New Roman" w:cs="Times New Roman"/>
+        </w:rPr>
+      </w:pPr>
+      <w:r>
+        <w:drawing>
+          <wp:inline distT="0" distB="0" distL="0" distR="0" wp14:anchorId="53568DEA" wp14:editId="39D1E653">
+            <wp:extent cx="5514975" cy="1714346"/>
+            <wp:effectExtent l="0" t="0" r="0" b="635"/>
+            <wp:docPr id="1286171375" name="Picture 1"/>
+            <wp:cNvGraphicFramePr>
+              <a:graphicFrameLocks xmlns:a="http://schemas.openxmlformats.org/drawingml/2006/main" noChangeAspect="1"/>
+            </wp:cNvGraphicFramePr>
+            <a:graphic xmlns:a="http://schemas.openxmlformats.org/drawingml/2006/main">
+              <a:graphicData uri="http://schemas.openxmlformats.org/drawingml/2006/picture">
+                <pic:pic xmlns:pic="http://schemas.openxmlformats.org/drawingml/2006/picture">
+                  <pic:nvPicPr>
+                    <pic:cNvPr id="1286171375" name=""/>
+                    <pic:cNvPicPr/>
+                  </pic:nvPicPr>
+                  <pic:blipFill>
+                    <a:blip r:embed="rId24"/>
+                    <a:stretch>
+                      <a:fillRect/>
+                    </a:stretch>
+                  </pic:blipFill>
+                  <pic:spPr>
+                    <a:xfrm>
+                      <a:off x="0" y="0"/>
+                      <a:ext cx="5538160" cy="1721553"/>
+                    </a:xfrm>
+                    <a:prstGeom prst="rect">
+                      <a:avLst/>
+                    </a:prstGeom>
+                  </pic:spPr>
+                </pic:pic>
+              </a:graphicData>
+            </a:graphic>
+          </wp:inline>
+        </w:drawing>
+      </w:r>
+    </w:p>
+    <w:p>
+      <w:pPr>
+        <w:rPr>
+          <w:rFonts w:ascii="Times New Roman" w:hAnsi="Times New Roman" w:cs="Times New Roman"/>
+        </w:rPr>
+      </w:pPr>
+    </w:p>
+    <w:p>
+      <w:pPr>
+        <w:rPr>
+          <w:rFonts w:ascii="Times New Roman" w:hAnsi="Times New Roman" w:cs="Times New Roman"/>
+        </w:rPr>
+      </w:pPr>
+      <w:r>
+        <w:rPr>
+          <w:rFonts w:ascii="Times New Roman" w:hAnsi="Times New Roman" w:cs="Times New Roman"/>
+        </w:rPr>
+        <w:t>The skills</w:t>
+      </w:r>
+      <w:r>
+        <w:rPr>
+          <w:rFonts w:ascii="Times New Roman" w:hAnsi="Times New Roman" w:cs="Times New Roman"/>
+        </w:rPr>
+        <w:t xml:space="preserve"> in the cards</w:t>
+      </w:r>
+      <w:r>
+        <w:rPr>
+          <w:rFonts w:ascii="Times New Roman" w:hAnsi="Times New Roman" w:cs="Times New Roman"/>
+        </w:rPr>
+        <w:t xml:space="preserve"> are stored as an array of objects</w:t>
+      </w:r>
+      <w:r>
+        <w:rPr>
+          <w:rFonts w:ascii="Times New Roman" w:hAnsi="Times New Roman" w:cs="Times New Roman"/>
+        </w:rPr>
+        <w:t xml:space="preserve"> “skills”</w:t>
+      </w:r>
+      <w:r>
+        <w:rPr>
+          <w:rFonts w:ascii="Times New Roman" w:hAnsi="Times New Roman" w:cs="Times New Roman"/>
+        </w:rPr>
+        <w:t xml:space="preserve">, with each object containing </w:t>
+      </w:r>
+      <w:r>
+        <w:rPr>
+          <w:rFonts w:ascii="Times New Roman" w:hAnsi="Times New Roman" w:cs="Times New Roman"/>
+        </w:rPr>
+        <w:t xml:space="preserve">the required </w:t>
+      </w:r>
+      <w:r>
+        <w:rPr>
+          <w:rFonts w:ascii="Times New Roman" w:hAnsi="Times New Roman" w:cs="Times New Roman"/>
+        </w:rPr>
+        <w:t xml:space="preserve">properties such as </w:t>
+      </w:r>
+      <w:r>
+        <w:rPr>
+          <w:rFonts w:ascii="Times New Roman" w:hAnsi="Times New Roman" w:cs="Times New Roman"/>
+        </w:rPr>
+        <w:t>i</w:t>
+      </w:r>
+      <w:r>
+        <w:rPr>
+          <w:rFonts w:ascii="Times New Roman" w:hAnsi="Times New Roman" w:cs="Times New Roman"/>
+        </w:rPr>
+        <w:t>d</w:t>
+      </w:r>
+      <w:r>
+        <w:rPr>
+          <w:rFonts w:ascii="Times New Roman" w:hAnsi="Times New Roman" w:cs="Times New Roman"/>
+        </w:rPr>
+        <w:t>, n</w:t>
+      </w:r>
+      <w:r>
+        <w:rPr>
+          <w:rFonts w:ascii="Times New Roman" w:hAnsi="Times New Roman" w:cs="Times New Roman"/>
+        </w:rPr>
+        <w:t>ame</w:t>
+      </w:r>
+      <w:r>
+        <w:rPr>
+          <w:rFonts w:ascii="Times New Roman" w:hAnsi="Times New Roman" w:cs="Times New Roman"/>
+        </w:rPr>
+        <w:t xml:space="preserve">, </w:t>
+      </w:r>
+      <w:r>
+        <w:rPr>
+          <w:rFonts w:ascii="Times New Roman" w:hAnsi="Times New Roman" w:cs="Times New Roman"/>
+        </w:rPr>
+        <w:t>category, proficiency,</w:t>
+      </w:r>
+      <w:r>
+        <w:rPr>
+          <w:rFonts w:ascii="Times New Roman" w:hAnsi="Times New Roman" w:cs="Times New Roman"/>
+        </w:rPr>
+        <w:t xml:space="preserve"> </w:t>
+      </w:r>
+      <w:r>
+        <w:rPr>
+          <w:rFonts w:ascii="Times New Roman" w:hAnsi="Times New Roman" w:cs="Times New Roman"/>
+        </w:rPr>
+        <w:t>yearsExperience</w:t>
+      </w:r>
+      <w:r>
+        <w:rPr>
+          <w:rFonts w:ascii="Times New Roman" w:hAnsi="Times New Roman" w:cs="Times New Roman"/>
+        </w:rPr>
+        <w:t xml:space="preserve">, </w:t>
+      </w:r>
+      <w:r>
+        <w:rPr>
+          <w:rFonts w:ascii="Times New Roman" w:hAnsi="Times New Roman" w:cs="Times New Roman"/>
+        </w:rPr>
+        <w:t>description, img</w:t>
+      </w:r>
+      <w:r>
+        <w:rPr>
+          <w:rFonts w:ascii="Times New Roman" w:hAnsi="Times New Roman" w:cs="Times New Roman"/>
+        </w:rPr>
+        <w:t xml:space="preserve"> and </w:t>
+      </w:r>
+      <w:r>
+        <w:rPr>
+          <w:rFonts w:ascii="Times New Roman" w:hAnsi="Times New Roman" w:cs="Times New Roman"/>
+        </w:rPr>
+        <w:t>sort</w:t>
+      </w:r>
+      <w:r>
+        <w:rPr>
+          <w:rFonts w:ascii="Times New Roman" w:hAnsi="Times New Roman" w:cs="Times New Roman"/>
+        </w:rPr>
+        <w:t>.</w:t>
+      </w:r>
+    </w:p>
+    <w:p>
+      <w:pPr>
+        <w:rPr>
+          <w:rFonts w:ascii="Times New Roman" w:hAnsi="Times New Roman" w:cs="Times New Roman"/>
+        </w:rPr>
+      </w:pPr>
+      <w:r>
+        <w:rPr>
+          <w:rFonts w:ascii="Times New Roman" w:hAnsi="Times New Roman" w:cs="Times New Roman"/>
+        </w:rPr>
+        <w:t>The cardGenerator(</w:t>
+      </w:r>
+      <w:r>
+        <w:rPr>
+          <w:rFonts w:ascii="Times New Roman" w:hAnsi="Times New Roman" w:cs="Times New Roman"/>
+        </w:rPr>
+        <w:t>arr</w:t>
+      </w:r>
+      <w:r>
+        <w:rPr>
+          <w:rFonts w:ascii="Times New Roman" w:hAnsi="Times New Roman" w:cs="Times New Roman"/>
+        </w:rPr>
+        <w:t xml:space="preserve">) function </w:t>
+      </w:r>
+      <w:r>
+        <w:rPr>
+          <w:rFonts w:ascii="Times New Roman" w:hAnsi="Times New Roman" w:cs="Times New Roman"/>
+        </w:rPr>
+        <w:t xml:space="preserve">takes the array of skills, </w:t>
+      </w:r>
+      <w:r>
+        <w:rPr>
+          <w:rFonts w:ascii="Times New Roman" w:hAnsi="Times New Roman" w:cs="Times New Roman"/>
+        </w:rPr>
+        <w:t>clears the card container, then loops through the array and creates a card for each item. It fills each card with the skill’s details, adds it to the page, and displays five star icons, filling as many as the skill’s proficiency rating. After rendering, it calls updateCards(arr)</w:t>
+      </w:r>
+      <w:r>
+        <w:rPr>
+          <w:rFonts w:ascii="Times New Roman" w:hAnsi="Times New Roman" w:cs="Times New Roman"/>
+        </w:rPr>
+        <w:t xml:space="preserve">, which </w:t>
+      </w:r>
+      <w:r>
+        <w:rPr>
+          <w:rFonts w:ascii="Times New Roman" w:hAnsi="Times New Roman" w:cs="Times New Roman"/>
+        </w:rPr>
+        <w:t>saves the displayed items in currentCards and updates the skill counter to show how many items are displayed. This keeps the page’s data and count in sync</w:t>
+      </w:r>
+      <w:r>
+        <w:rPr>
+          <w:rFonts w:ascii="Times New Roman" w:hAnsi="Times New Roman" w:cs="Times New Roman"/>
+        </w:rPr>
+        <w:t xml:space="preserve"> and allows the rendering of the array of cards as its filtered and sorted.</w:t>
       </w:r>
     </w:p>
     <w:p>
@@ -5745,13 +5403,13 @@
     </w:lvl>
   </w:abstractNum>
   <w:abstractNum w:abstractNumId="3" w15:restartNumberingAfterBreak="0">
-    <w:nsid w:val="7C49536C"/>
+    <w:nsid w:val="53193929"/>
     <w:multiLevelType w:val="hybridMultilevel"/>
-    <w:tmpl w:val="F8D0DBAA"/>
-    <w:lvl w:ilvl="0" w:tplc="08090017">
+    <w:tmpl w:val="7706BFAA"/>
+    <w:lvl w:ilvl="0" w:tplc="0809000F">
       <w:start w:val="1"/>
-      <w:numFmt w:val="lowerLetter"/>
-      <w:lvlText w:val="%1)"/>
+      <w:numFmt w:val="decimal"/>
+      <w:lvlText w:val="%1."/>
       <w:lvlJc w:val="left"/>
       <w:pPr>
         <w:ind w:left="720" w:hanging="360"/>
@@ -5833,17 +5491,109 @@
       </w:pPr>
     </w:lvl>
   </w:abstractNum>
+  <w:abstractNum w:abstractNumId="4" w15:restartNumberingAfterBreak="0">
+    <w:nsid w:val="7C49536C"/>
+    <w:multiLevelType w:val="hybridMultilevel"/>
+    <w:tmpl w:val="F8D0DBAA"/>
+    <w:lvl w:ilvl="0" w:tplc="08090017">
+      <w:start w:val="1"/>
+      <w:numFmt w:val="lowerLetter"/>
+      <w:lvlText w:val="%1)"/>
+      <w:lvlJc w:val="left"/>
+      <w:pPr>
+        <w:ind w:left="720" w:hanging="360"/>
+      </w:pPr>
+      <w:rPr>
+        <w:rFonts w:hint="default"/>
+      </w:rPr>
+    </w:lvl>
+    <w:lvl w:ilvl="1" w:tplc="08090019" w:tentative="1">
+      <w:start w:val="1"/>
+      <w:numFmt w:val="lowerLetter"/>
+      <w:lvlText w:val="%2."/>
+      <w:lvlJc w:val="left"/>
+      <w:pPr>
+        <w:ind w:left="1440" w:hanging="360"/>
+      </w:pPr>
+    </w:lvl>
+    <w:lvl w:ilvl="2" w:tplc="0809001B" w:tentative="1">
+      <w:start w:val="1"/>
+      <w:numFmt w:val="lowerRoman"/>
+      <w:lvlText w:val="%3."/>
+      <w:lvlJc w:val="right"/>
+      <w:pPr>
+        <w:ind w:left="2160" w:hanging="180"/>
+      </w:pPr>
+    </w:lvl>
+    <w:lvl w:ilvl="3" w:tplc="0809000F" w:tentative="1">
+      <w:start w:val="1"/>
+      <w:numFmt w:val="decimal"/>
+      <w:lvlText w:val="%4."/>
+      <w:lvlJc w:val="left"/>
+      <w:pPr>
+        <w:ind w:left="2880" w:hanging="360"/>
+      </w:pPr>
+    </w:lvl>
+    <w:lvl w:ilvl="4" w:tplc="08090019" w:tentative="1">
+      <w:start w:val="1"/>
+      <w:numFmt w:val="lowerLetter"/>
+      <w:lvlText w:val="%5."/>
+      <w:lvlJc w:val="left"/>
+      <w:pPr>
+        <w:ind w:left="3600" w:hanging="360"/>
+      </w:pPr>
+    </w:lvl>
+    <w:lvl w:ilvl="5" w:tplc="0809001B" w:tentative="1">
+      <w:start w:val="1"/>
+      <w:numFmt w:val="lowerRoman"/>
+      <w:lvlText w:val="%6."/>
+      <w:lvlJc w:val="right"/>
+      <w:pPr>
+        <w:ind w:left="4320" w:hanging="180"/>
+      </w:pPr>
+    </w:lvl>
+    <w:lvl w:ilvl="6" w:tplc="0809000F" w:tentative="1">
+      <w:start w:val="1"/>
+      <w:numFmt w:val="decimal"/>
+      <w:lvlText w:val="%7."/>
+      <w:lvlJc w:val="left"/>
+      <w:pPr>
+        <w:ind w:left="5040" w:hanging="360"/>
+      </w:pPr>
+    </w:lvl>
+    <w:lvl w:ilvl="7" w:tplc="08090019" w:tentative="1">
+      <w:start w:val="1"/>
+      <w:numFmt w:val="lowerLetter"/>
+      <w:lvlText w:val="%8."/>
+      <w:lvlJc w:val="left"/>
+      <w:pPr>
+        <w:ind w:left="5760" w:hanging="360"/>
+      </w:pPr>
+    </w:lvl>
+    <w:lvl w:ilvl="8" w:tplc="0809001B" w:tentative="1">
+      <w:start w:val="1"/>
+      <w:numFmt w:val="lowerRoman"/>
+      <w:lvlText w:val="%9."/>
+      <w:lvlJc w:val="right"/>
+      <w:pPr>
+        <w:ind w:left="6480" w:hanging="180"/>
+      </w:pPr>
+    </w:lvl>
+  </w:abstractNum>
   <w:num w:numId="1" w16cid:durableId="1855455647">
     <w:abstractNumId w:val="1"/>
   </w:num>
   <w:num w:numId="2" w16cid:durableId="1868367301">
-    <w:abstractNumId w:val="3"/>
+    <w:abstractNumId w:val="4"/>
   </w:num>
   <w:num w:numId="3" w16cid:durableId="277371677">
     <w:abstractNumId w:val="2"/>
   </w:num>
   <w:num w:numId="4" w16cid:durableId="315375168">
     <w:abstractNumId w:val="0"/>
+  </w:num>
+  <w:num w:numId="5" w16cid:durableId="234827253">
+    <w:abstractNumId w:val="3"/>
   </w:num>
 </w:numbering>
 </file>

</xml_diff>

<commit_message>
Updated required names and documentation
Changed the updateSettings function to be applySettings as required in the Lab2 list.
</commit_message>
<xml_diff>
--- a/documentation/CRM-HKR-2026_Lab2_documentation/CRM-HKR-2026_Lab2.docx
+++ b/documentation/CRM-HKR-2026_Lab2_documentation/CRM-HKR-2026_Lab2.docx
@@ -579,7 +579,25 @@
           <w:b/>
           <w:bCs/>
         </w:rPr>
-        <w:t>Evidence form validation:</w:t>
+        <w:t xml:space="preserve">Evidence </w:t>
+      </w:r>
+      <w:proofErr w:type="gramStart"/>
+      <w:r>
+        <w:rPr>
+          <w:rFonts w:ascii="Times New Roman" w:hAnsi="Times New Roman" w:cs="Times New Roman"/>
+          <w:b/>
+          <w:bCs/>
+        </w:rPr>
+        <w:t>form</w:t>
+      </w:r>
+      <w:proofErr w:type="gramEnd"/>
+      <w:r>
+        <w:rPr>
+          <w:rFonts w:ascii="Times New Roman" w:hAnsi="Times New Roman" w:cs="Times New Roman"/>
+          <w:b/>
+          <w:bCs/>
+        </w:rPr>
+        <w:t xml:space="preserve"> validation:</w:t>
       </w:r>
     </w:p>
     <w:p>
@@ -1290,7 +1308,61 @@
           <w:sz w:val="22"/>
           <w:szCs w:val="22"/>
         </w:rPr>
-        <w:t>Main function: clickAndShow(showMe, hideMe)</w:t>
+        <w:t xml:space="preserve">Main function: </w:t>
+      </w:r>
+      <w:proofErr w:type="spellStart"/>
+      <w:r>
+        <w:rPr>
+          <w:rFonts w:ascii="Times New Roman" w:hAnsi="Times New Roman" w:cs="Times New Roman"/>
+          <w:sz w:val="22"/>
+          <w:szCs w:val="22"/>
+        </w:rPr>
+        <w:t>clickAndShow</w:t>
+      </w:r>
+      <w:proofErr w:type="spellEnd"/>
+      <w:r>
+        <w:rPr>
+          <w:rFonts w:ascii="Times New Roman" w:hAnsi="Times New Roman" w:cs="Times New Roman"/>
+          <w:sz w:val="22"/>
+          <w:szCs w:val="22"/>
+        </w:rPr>
+        <w:t>(</w:t>
+      </w:r>
+      <w:proofErr w:type="spellStart"/>
+      <w:r>
+        <w:rPr>
+          <w:rFonts w:ascii="Times New Roman" w:hAnsi="Times New Roman" w:cs="Times New Roman"/>
+          <w:sz w:val="22"/>
+          <w:szCs w:val="22"/>
+        </w:rPr>
+        <w:t>showMe</w:t>
+      </w:r>
+      <w:proofErr w:type="spellEnd"/>
+      <w:r>
+        <w:rPr>
+          <w:rFonts w:ascii="Times New Roman" w:hAnsi="Times New Roman" w:cs="Times New Roman"/>
+          <w:sz w:val="22"/>
+          <w:szCs w:val="22"/>
+        </w:rPr>
+        <w:t xml:space="preserve">, </w:t>
+      </w:r>
+      <w:proofErr w:type="spellStart"/>
+      <w:r>
+        <w:rPr>
+          <w:rFonts w:ascii="Times New Roman" w:hAnsi="Times New Roman" w:cs="Times New Roman"/>
+          <w:sz w:val="22"/>
+          <w:szCs w:val="22"/>
+        </w:rPr>
+        <w:t>hideMe</w:t>
+      </w:r>
+      <w:proofErr w:type="spellEnd"/>
+      <w:r>
+        <w:rPr>
+          <w:rFonts w:ascii="Times New Roman" w:hAnsi="Times New Roman" w:cs="Times New Roman"/>
+          <w:sz w:val="22"/>
+          <w:szCs w:val="22"/>
+        </w:rPr>
+        <w:t>)</w:t>
       </w:r>
     </w:p>
     <w:p>
@@ -1345,7 +1417,25 @@
           <w:sz w:val="22"/>
           <w:szCs w:val="22"/>
         </w:rPr>
-        <w:t>1. addEventListener "click” detects when the user clicks the button.</w:t>
+        <w:t xml:space="preserve">1. </w:t>
+      </w:r>
+      <w:proofErr w:type="spellStart"/>
+      <w:r>
+        <w:rPr>
+          <w:rFonts w:ascii="Times New Roman" w:hAnsi="Times New Roman" w:cs="Times New Roman"/>
+          <w:sz w:val="22"/>
+          <w:szCs w:val="22"/>
+        </w:rPr>
+        <w:t>addEventListener</w:t>
+      </w:r>
+      <w:proofErr w:type="spellEnd"/>
+      <w:r>
+        <w:rPr>
+          <w:rFonts w:ascii="Times New Roman" w:hAnsi="Times New Roman" w:cs="Times New Roman"/>
+          <w:sz w:val="22"/>
+          <w:szCs w:val="22"/>
+        </w:rPr>
+        <w:t xml:space="preserve"> "click” detects when the user clicks the button.</w:t>
       </w:r>
     </w:p>
     <w:p>
@@ -1364,7 +1454,61 @@
           <w:sz w:val="22"/>
           <w:szCs w:val="22"/>
         </w:rPr>
-        <w:t>2. The event calls clickAndShow(fullTxt, readMore).</w:t>
+        <w:t xml:space="preserve">2. The event calls </w:t>
+      </w:r>
+      <w:proofErr w:type="spellStart"/>
+      <w:r>
+        <w:rPr>
+          <w:rFonts w:ascii="Times New Roman" w:hAnsi="Times New Roman" w:cs="Times New Roman"/>
+          <w:sz w:val="22"/>
+          <w:szCs w:val="22"/>
+        </w:rPr>
+        <w:t>clickAndShow</w:t>
+      </w:r>
+      <w:proofErr w:type="spellEnd"/>
+      <w:r>
+        <w:rPr>
+          <w:rFonts w:ascii="Times New Roman" w:hAnsi="Times New Roman" w:cs="Times New Roman"/>
+          <w:sz w:val="22"/>
+          <w:szCs w:val="22"/>
+        </w:rPr>
+        <w:t>(</w:t>
+      </w:r>
+      <w:proofErr w:type="spellStart"/>
+      <w:r>
+        <w:rPr>
+          <w:rFonts w:ascii="Times New Roman" w:hAnsi="Times New Roman" w:cs="Times New Roman"/>
+          <w:sz w:val="22"/>
+          <w:szCs w:val="22"/>
+        </w:rPr>
+        <w:t>fullTxt</w:t>
+      </w:r>
+      <w:proofErr w:type="spellEnd"/>
+      <w:r>
+        <w:rPr>
+          <w:rFonts w:ascii="Times New Roman" w:hAnsi="Times New Roman" w:cs="Times New Roman"/>
+          <w:sz w:val="22"/>
+          <w:szCs w:val="22"/>
+        </w:rPr>
+        <w:t xml:space="preserve">, </w:t>
+      </w:r>
+      <w:proofErr w:type="spellStart"/>
+      <w:r>
+        <w:rPr>
+          <w:rFonts w:ascii="Times New Roman" w:hAnsi="Times New Roman" w:cs="Times New Roman"/>
+          <w:sz w:val="22"/>
+          <w:szCs w:val="22"/>
+        </w:rPr>
+        <w:t>readMore</w:t>
+      </w:r>
+      <w:proofErr w:type="spellEnd"/>
+      <w:r>
+        <w:rPr>
+          <w:rFonts w:ascii="Times New Roman" w:hAnsi="Times New Roman" w:cs="Times New Roman"/>
+          <w:sz w:val="22"/>
+          <w:szCs w:val="22"/>
+        </w:rPr>
+        <w:t>).</w:t>
       </w:r>
     </w:p>
     <w:p>
@@ -1421,7 +1565,25 @@
           <w:sz w:val="22"/>
           <w:szCs w:val="22"/>
         </w:rPr>
-        <w:t>5. The readMore button is hidden by setting its display to "none".</w:t>
+        <w:t xml:space="preserve">5. The </w:t>
+      </w:r>
+      <w:proofErr w:type="spellStart"/>
+      <w:r>
+        <w:rPr>
+          <w:rFonts w:ascii="Times New Roman" w:hAnsi="Times New Roman" w:cs="Times New Roman"/>
+          <w:sz w:val="22"/>
+          <w:szCs w:val="22"/>
+        </w:rPr>
+        <w:t>readMore</w:t>
+      </w:r>
+      <w:proofErr w:type="spellEnd"/>
+      <w:r>
+        <w:rPr>
+          <w:rFonts w:ascii="Times New Roman" w:hAnsi="Times New Roman" w:cs="Times New Roman"/>
+          <w:sz w:val="22"/>
+          <w:szCs w:val="22"/>
+        </w:rPr>
+        <w:t xml:space="preserve"> button is hidden by setting its display to "none".</w:t>
       </w:r>
     </w:p>
     <w:p>
@@ -1726,6 +1888,7 @@
                 <w:szCs w:val="20"/>
               </w:rPr>
             </w:pPr>
+            <w:proofErr w:type="spellStart"/>
             <w:r>
               <w:rPr>
                 <w:rFonts w:ascii="Times New Roman" w:hAnsi="Times New Roman" w:cs="Times New Roman"/>
@@ -1734,6 +1897,7 @@
               </w:rPr>
               <w:t>isName</w:t>
             </w:r>
+            <w:proofErr w:type="spellEnd"/>
           </w:p>
         </w:tc>
       </w:tr>
@@ -1791,7 +1955,25 @@
                 <w:sz w:val="20"/>
                 <w:szCs w:val="20"/>
               </w:rPr>
-              <w:t>Must not be empty, must begin with a letter, match emailRegex, and contain more than eight characters.</w:t>
+              <w:t xml:space="preserve">Must not be empty, must begin with a letter, match </w:t>
+            </w:r>
+            <w:proofErr w:type="spellStart"/>
+            <w:r>
+              <w:rPr>
+                <w:rFonts w:ascii="Times New Roman" w:hAnsi="Times New Roman" w:cs="Times New Roman"/>
+                <w:sz w:val="20"/>
+                <w:szCs w:val="20"/>
+              </w:rPr>
+              <w:t>emailRegex</w:t>
+            </w:r>
+            <w:proofErr w:type="spellEnd"/>
+            <w:r>
+              <w:rPr>
+                <w:rFonts w:ascii="Times New Roman" w:hAnsi="Times New Roman" w:cs="Times New Roman"/>
+                <w:sz w:val="20"/>
+                <w:szCs w:val="20"/>
+              </w:rPr>
+              <w:t>, and contain more than eight characters.</w:t>
             </w:r>
           </w:p>
         </w:tc>
@@ -1810,6 +1992,7 @@
                 <w:szCs w:val="20"/>
               </w:rPr>
             </w:pPr>
+            <w:proofErr w:type="spellStart"/>
             <w:r>
               <w:rPr>
                 <w:rFonts w:ascii="Times New Roman" w:hAnsi="Times New Roman" w:cs="Times New Roman"/>
@@ -1818,6 +2001,7 @@
               </w:rPr>
               <w:t>isEmail</w:t>
             </w:r>
+            <w:proofErr w:type="spellEnd"/>
           </w:p>
         </w:tc>
       </w:tr>
@@ -1894,6 +2078,7 @@
                 <w:szCs w:val="20"/>
               </w:rPr>
             </w:pPr>
+            <w:proofErr w:type="spellStart"/>
             <w:r>
               <w:rPr>
                 <w:rFonts w:ascii="Times New Roman" w:hAnsi="Times New Roman" w:cs="Times New Roman"/>
@@ -1902,6 +2087,7 @@
               </w:rPr>
               <w:t>isMessage</w:t>
             </w:r>
+            <w:proofErr w:type="spellEnd"/>
           </w:p>
         </w:tc>
       </w:tr>
@@ -1957,7 +2143,61 @@
           <w:sz w:val="22"/>
           <w:szCs w:val="22"/>
         </w:rPr>
-        <w:t>Main function and event: A click listener on subjectInput reads the selected value and uses subjectSelected to determine how to handle it. A selection applies the is-selected class, green styling, and sets isSubject to true; an empty selection triggers an error and red styling.</w:t>
+        <w:t xml:space="preserve">Main function and event: A click listener on </w:t>
+      </w:r>
+      <w:proofErr w:type="spellStart"/>
+      <w:r>
+        <w:rPr>
+          <w:rFonts w:ascii="Times New Roman" w:hAnsi="Times New Roman" w:cs="Times New Roman"/>
+          <w:sz w:val="22"/>
+          <w:szCs w:val="22"/>
+        </w:rPr>
+        <w:t>subjectInput</w:t>
+      </w:r>
+      <w:proofErr w:type="spellEnd"/>
+      <w:r>
+        <w:rPr>
+          <w:rFonts w:ascii="Times New Roman" w:hAnsi="Times New Roman" w:cs="Times New Roman"/>
+          <w:sz w:val="22"/>
+          <w:szCs w:val="22"/>
+        </w:rPr>
+        <w:t xml:space="preserve"> reads the selected value and uses </w:t>
+      </w:r>
+      <w:proofErr w:type="spellStart"/>
+      <w:r>
+        <w:rPr>
+          <w:rFonts w:ascii="Times New Roman" w:hAnsi="Times New Roman" w:cs="Times New Roman"/>
+          <w:sz w:val="22"/>
+          <w:szCs w:val="22"/>
+        </w:rPr>
+        <w:t>subjectSelected</w:t>
+      </w:r>
+      <w:proofErr w:type="spellEnd"/>
+      <w:r>
+        <w:rPr>
+          <w:rFonts w:ascii="Times New Roman" w:hAnsi="Times New Roman" w:cs="Times New Roman"/>
+          <w:sz w:val="22"/>
+          <w:szCs w:val="22"/>
+        </w:rPr>
+        <w:t xml:space="preserve"> to determine how to handle it. A selection applies the is-selected class, green styling, and sets </w:t>
+      </w:r>
+      <w:proofErr w:type="spellStart"/>
+      <w:r>
+        <w:rPr>
+          <w:rFonts w:ascii="Times New Roman" w:hAnsi="Times New Roman" w:cs="Times New Roman"/>
+          <w:sz w:val="22"/>
+          <w:szCs w:val="22"/>
+        </w:rPr>
+        <w:t>isSubject</w:t>
+      </w:r>
+      <w:proofErr w:type="spellEnd"/>
+      <w:r>
+        <w:rPr>
+          <w:rFonts w:ascii="Times New Roman" w:hAnsi="Times New Roman" w:cs="Times New Roman"/>
+          <w:sz w:val="22"/>
+          <w:szCs w:val="22"/>
+        </w:rPr>
+        <w:t xml:space="preserve"> to true; an empty selection triggers an error and red styling.</w:t>
       </w:r>
     </w:p>
     <w:p>
@@ -1975,7 +2215,61 @@
           <w:sz w:val="22"/>
           <w:szCs w:val="22"/>
         </w:rPr>
-        <w:t>Difference and limitation: Subject validation runs on clicks and checks a selection, unlike the text fields, which validate while the user types. Also, subjectValue is a string, so checking subjectValue.value == "" will not reliably detect an empty value. The subjectSelected state also makes the result depend on the sequence of clicks.</w:t>
+        <w:t xml:space="preserve">Difference and limitation: Subject validation runs on clicks and checks a selection, unlike the text fields, which validate while the user types. Also, </w:t>
+      </w:r>
+      <w:proofErr w:type="spellStart"/>
+      <w:r>
+        <w:rPr>
+          <w:rFonts w:ascii="Times New Roman" w:hAnsi="Times New Roman" w:cs="Times New Roman"/>
+          <w:sz w:val="22"/>
+          <w:szCs w:val="22"/>
+        </w:rPr>
+        <w:t>subjectValue</w:t>
+      </w:r>
+      <w:proofErr w:type="spellEnd"/>
+      <w:r>
+        <w:rPr>
+          <w:rFonts w:ascii="Times New Roman" w:hAnsi="Times New Roman" w:cs="Times New Roman"/>
+          <w:sz w:val="22"/>
+          <w:szCs w:val="22"/>
+        </w:rPr>
+        <w:t xml:space="preserve"> is a string, so checking </w:t>
+      </w:r>
+      <w:proofErr w:type="spellStart"/>
+      <w:r>
+        <w:rPr>
+          <w:rFonts w:ascii="Times New Roman" w:hAnsi="Times New Roman" w:cs="Times New Roman"/>
+          <w:sz w:val="22"/>
+          <w:szCs w:val="22"/>
+        </w:rPr>
+        <w:t>subjectValue.value</w:t>
+      </w:r>
+      <w:proofErr w:type="spellEnd"/>
+      <w:r>
+        <w:rPr>
+          <w:rFonts w:ascii="Times New Roman" w:hAnsi="Times New Roman" w:cs="Times New Roman"/>
+          <w:sz w:val="22"/>
+          <w:szCs w:val="22"/>
+        </w:rPr>
+        <w:t xml:space="preserve"> == "" will not reliably detect an empty value. The </w:t>
+      </w:r>
+      <w:proofErr w:type="spellStart"/>
+      <w:r>
+        <w:rPr>
+          <w:rFonts w:ascii="Times New Roman" w:hAnsi="Times New Roman" w:cs="Times New Roman"/>
+          <w:sz w:val="22"/>
+          <w:szCs w:val="22"/>
+        </w:rPr>
+        <w:t>subjectSelected</w:t>
+      </w:r>
+      <w:proofErr w:type="spellEnd"/>
+      <w:r>
+        <w:rPr>
+          <w:rFonts w:ascii="Times New Roman" w:hAnsi="Times New Roman" w:cs="Times New Roman"/>
+          <w:sz w:val="22"/>
+          <w:szCs w:val="22"/>
+        </w:rPr>
+        <w:t xml:space="preserve"> state also makes the result depend on the sequence of clicks.</w:t>
       </w:r>
     </w:p>
     <w:p>
@@ -2066,7 +2360,25 @@
           <w:sz w:val="22"/>
           <w:szCs w:val="22"/>
         </w:rPr>
-        <w:t>1. e.preventDefault() stops the browser from submitting the form in its default way.</w:t>
+        <w:t xml:space="preserve">1. </w:t>
+      </w:r>
+      <w:proofErr w:type="spellStart"/>
+      <w:r>
+        <w:rPr>
+          <w:rFonts w:ascii="Times New Roman" w:hAnsi="Times New Roman" w:cs="Times New Roman"/>
+          <w:sz w:val="22"/>
+          <w:szCs w:val="22"/>
+        </w:rPr>
+        <w:t>e.preventDefault</w:t>
+      </w:r>
+      <w:proofErr w:type="spellEnd"/>
+      <w:r>
+        <w:rPr>
+          <w:rFonts w:ascii="Times New Roman" w:hAnsi="Times New Roman" w:cs="Times New Roman"/>
+          <w:sz w:val="22"/>
+          <w:szCs w:val="22"/>
+        </w:rPr>
+        <w:t>() stops the browser from submitting the form in its default way.</w:t>
       </w:r>
     </w:p>
     <w:p>
@@ -2085,7 +2397,79 @@
           <w:sz w:val="22"/>
           <w:szCs w:val="22"/>
         </w:rPr>
-        <w:t>2. The code checks whether isName, isEmail, isMessage, and isSubject are all true.</w:t>
+        <w:t xml:space="preserve">2. The code checks whether </w:t>
+      </w:r>
+      <w:proofErr w:type="spellStart"/>
+      <w:r>
+        <w:rPr>
+          <w:rFonts w:ascii="Times New Roman" w:hAnsi="Times New Roman" w:cs="Times New Roman"/>
+          <w:sz w:val="22"/>
+          <w:szCs w:val="22"/>
+        </w:rPr>
+        <w:t>isName</w:t>
+      </w:r>
+      <w:proofErr w:type="spellEnd"/>
+      <w:r>
+        <w:rPr>
+          <w:rFonts w:ascii="Times New Roman" w:hAnsi="Times New Roman" w:cs="Times New Roman"/>
+          <w:sz w:val="22"/>
+          <w:szCs w:val="22"/>
+        </w:rPr>
+        <w:t xml:space="preserve">, </w:t>
+      </w:r>
+      <w:proofErr w:type="spellStart"/>
+      <w:r>
+        <w:rPr>
+          <w:rFonts w:ascii="Times New Roman" w:hAnsi="Times New Roman" w:cs="Times New Roman"/>
+          <w:sz w:val="22"/>
+          <w:szCs w:val="22"/>
+        </w:rPr>
+        <w:t>isEmail</w:t>
+      </w:r>
+      <w:proofErr w:type="spellEnd"/>
+      <w:r>
+        <w:rPr>
+          <w:rFonts w:ascii="Times New Roman" w:hAnsi="Times New Roman" w:cs="Times New Roman"/>
+          <w:sz w:val="22"/>
+          <w:szCs w:val="22"/>
+        </w:rPr>
+        <w:t xml:space="preserve">, </w:t>
+      </w:r>
+      <w:proofErr w:type="spellStart"/>
+      <w:r>
+        <w:rPr>
+          <w:rFonts w:ascii="Times New Roman" w:hAnsi="Times New Roman" w:cs="Times New Roman"/>
+          <w:sz w:val="22"/>
+          <w:szCs w:val="22"/>
+        </w:rPr>
+        <w:t>isMessage</w:t>
+      </w:r>
+      <w:proofErr w:type="spellEnd"/>
+      <w:r>
+        <w:rPr>
+          <w:rFonts w:ascii="Times New Roman" w:hAnsi="Times New Roman" w:cs="Times New Roman"/>
+          <w:sz w:val="22"/>
+          <w:szCs w:val="22"/>
+        </w:rPr>
+        <w:t xml:space="preserve">, and </w:t>
+      </w:r>
+      <w:proofErr w:type="spellStart"/>
+      <w:r>
+        <w:rPr>
+          <w:rFonts w:ascii="Times New Roman" w:hAnsi="Times New Roman" w:cs="Times New Roman"/>
+          <w:sz w:val="22"/>
+          <w:szCs w:val="22"/>
+        </w:rPr>
+        <w:t>isSubject</w:t>
+      </w:r>
+      <w:proofErr w:type="spellEnd"/>
+      <w:r>
+        <w:rPr>
+          <w:rFonts w:ascii="Times New Roman" w:hAnsi="Times New Roman" w:cs="Times New Roman"/>
+          <w:sz w:val="22"/>
+          <w:szCs w:val="22"/>
+        </w:rPr>
+        <w:t xml:space="preserve"> are all true.</w:t>
       </w:r>
     </w:p>
     <w:p>
@@ -2123,7 +2507,25 @@
           <w:sz w:val="22"/>
           <w:szCs w:val="22"/>
         </w:rPr>
-        <w:t>4. If all flags are true, window.scrollTo(0, 0) scrolls the page to the top.</w:t>
+        <w:t xml:space="preserve">4. If all flags are true, </w:t>
+      </w:r>
+      <w:proofErr w:type="spellStart"/>
+      <w:r>
+        <w:rPr>
+          <w:rFonts w:ascii="Times New Roman" w:hAnsi="Times New Roman" w:cs="Times New Roman"/>
+          <w:sz w:val="22"/>
+          <w:szCs w:val="22"/>
+        </w:rPr>
+        <w:t>window.scrollTo</w:t>
+      </w:r>
+      <w:proofErr w:type="spellEnd"/>
+      <w:r>
+        <w:rPr>
+          <w:rFonts w:ascii="Times New Roman" w:hAnsi="Times New Roman" w:cs="Times New Roman"/>
+          <w:sz w:val="22"/>
+          <w:szCs w:val="22"/>
+        </w:rPr>
+        <w:t>(0, 0) scrolls the page to the top.</w:t>
       </w:r>
     </w:p>
     <w:p>
@@ -2143,7 +2545,25 @@
           <w:szCs w:val="22"/>
         </w:rPr>
         <w:lastRenderedPageBreak/>
-        <w:t>5. The code displays the success message “Successfully submited!” and adds a link back to index.html.</w:t>
+        <w:t xml:space="preserve">5. The code displays the success message “Successfully </w:t>
+      </w:r>
+      <w:proofErr w:type="spellStart"/>
+      <w:r>
+        <w:rPr>
+          <w:rFonts w:ascii="Times New Roman" w:hAnsi="Times New Roman" w:cs="Times New Roman"/>
+          <w:sz w:val="22"/>
+          <w:szCs w:val="22"/>
+        </w:rPr>
+        <w:t>submited</w:t>
+      </w:r>
+      <w:proofErr w:type="spellEnd"/>
+      <w:r>
+        <w:rPr>
+          <w:rFonts w:ascii="Times New Roman" w:hAnsi="Times New Roman" w:cs="Times New Roman"/>
+          <w:sz w:val="22"/>
+          <w:szCs w:val="22"/>
+        </w:rPr>
+        <w:t>!” and adds a link back to index.html.</w:t>
       </w:r>
     </w:p>
     <w:p>
@@ -2162,7 +2582,25 @@
           <w:sz w:val="22"/>
           <w:szCs w:val="22"/>
         </w:rPr>
-        <w:t>6. The form is hidden using form.style.display = "none".</w:t>
+        <w:t xml:space="preserve">6. The form is hidden using </w:t>
+      </w:r>
+      <w:proofErr w:type="spellStart"/>
+      <w:r>
+        <w:rPr>
+          <w:rFonts w:ascii="Times New Roman" w:hAnsi="Times New Roman" w:cs="Times New Roman"/>
+          <w:sz w:val="22"/>
+          <w:szCs w:val="22"/>
+        </w:rPr>
+        <w:t>form.style.display</w:t>
+      </w:r>
+      <w:proofErr w:type="spellEnd"/>
+      <w:r>
+        <w:rPr>
+          <w:rFonts w:ascii="Times New Roman" w:hAnsi="Times New Roman" w:cs="Times New Roman"/>
+          <w:sz w:val="22"/>
+          <w:szCs w:val="22"/>
+        </w:rPr>
+        <w:t xml:space="preserve"> = "none".</w:t>
       </w:r>
     </w:p>
     <w:p>
@@ -2216,7 +2654,25 @@
           <w:sz w:val="22"/>
           <w:szCs w:val="22"/>
         </w:rPr>
-        <w:t>The setTimeout() function schedules another update after four seconds.</w:t>
+        <w:t xml:space="preserve">The </w:t>
+      </w:r>
+      <w:proofErr w:type="spellStart"/>
+      <w:r>
+        <w:rPr>
+          <w:rFonts w:ascii="Times New Roman" w:hAnsi="Times New Roman" w:cs="Times New Roman"/>
+          <w:sz w:val="22"/>
+          <w:szCs w:val="22"/>
+        </w:rPr>
+        <w:t>setTimeout</w:t>
+      </w:r>
+      <w:proofErr w:type="spellEnd"/>
+      <w:r>
+        <w:rPr>
+          <w:rFonts w:ascii="Times New Roman" w:hAnsi="Times New Roman" w:cs="Times New Roman"/>
+          <w:sz w:val="22"/>
+          <w:szCs w:val="22"/>
+        </w:rPr>
+        <w:t>() function schedules another update after four seconds.</w:t>
       </w:r>
     </w:p>
     <w:p>
@@ -2253,7 +2709,25 @@
           <w:sz w:val="22"/>
           <w:szCs w:val="22"/>
         </w:rPr>
-        <w:t>- Makes the form visible again using form.style.display = "flex".</w:t>
+        <w:t xml:space="preserve">- Makes the form visible again using </w:t>
+      </w:r>
+      <w:proofErr w:type="spellStart"/>
+      <w:r>
+        <w:rPr>
+          <w:rFonts w:ascii="Times New Roman" w:hAnsi="Times New Roman" w:cs="Times New Roman"/>
+          <w:sz w:val="22"/>
+          <w:szCs w:val="22"/>
+        </w:rPr>
+        <w:t>form.style.display</w:t>
+      </w:r>
+      <w:proofErr w:type="spellEnd"/>
+      <w:r>
+        <w:rPr>
+          <w:rFonts w:ascii="Times New Roman" w:hAnsi="Times New Roman" w:cs="Times New Roman"/>
+          <w:sz w:val="22"/>
+          <w:szCs w:val="22"/>
+        </w:rPr>
+        <w:t xml:space="preserve"> = "flex".</w:t>
       </w:r>
     </w:p>
     <w:p>
@@ -2418,13 +2892,23 @@
           <w:szCs w:val="22"/>
         </w:rPr>
       </w:pPr>
-      <w:r>
-        <w:rPr>
-          <w:rFonts w:ascii="Times New Roman" w:hAnsi="Times New Roman" w:cs="Times New Roman"/>
-          <w:sz w:val="22"/>
-          <w:szCs w:val="22"/>
-        </w:rPr>
-        <w:t>setError(input, error, message)</w:t>
+      <w:proofErr w:type="spellStart"/>
+      <w:r>
+        <w:rPr>
+          <w:rFonts w:ascii="Times New Roman" w:hAnsi="Times New Roman" w:cs="Times New Roman"/>
+          <w:sz w:val="22"/>
+          <w:szCs w:val="22"/>
+        </w:rPr>
+        <w:t>setError</w:t>
+      </w:r>
+      <w:proofErr w:type="spellEnd"/>
+      <w:r>
+        <w:rPr>
+          <w:rFonts w:ascii="Times New Roman" w:hAnsi="Times New Roman" w:cs="Times New Roman"/>
+          <w:sz w:val="22"/>
+          <w:szCs w:val="22"/>
+        </w:rPr>
+        <w:t>(input, error, message)</w:t>
       </w:r>
     </w:p>
     <w:p>
@@ -2462,7 +2946,25 @@
           <w:sz w:val="22"/>
           <w:szCs w:val="22"/>
         </w:rPr>
-        <w:t>- Sets isValid to false.</w:t>
+        <w:t xml:space="preserve">- Sets </w:t>
+      </w:r>
+      <w:proofErr w:type="spellStart"/>
+      <w:r>
+        <w:rPr>
+          <w:rFonts w:ascii="Times New Roman" w:hAnsi="Times New Roman" w:cs="Times New Roman"/>
+          <w:sz w:val="22"/>
+          <w:szCs w:val="22"/>
+        </w:rPr>
+        <w:t>isValid</w:t>
+      </w:r>
+      <w:proofErr w:type="spellEnd"/>
+      <w:r>
+        <w:rPr>
+          <w:rFonts w:ascii="Times New Roman" w:hAnsi="Times New Roman" w:cs="Times New Roman"/>
+          <w:sz w:val="22"/>
+          <w:szCs w:val="22"/>
+        </w:rPr>
+        <w:t xml:space="preserve"> to false.</w:t>
       </w:r>
     </w:p>
     <w:p>
@@ -2497,7 +2999,25 @@
           <w:sz w:val="22"/>
           <w:szCs w:val="22"/>
         </w:rPr>
-        <w:t xml:space="preserve"> invalid field in invalidField, if one has not already been saved.</w:t>
+        <w:t xml:space="preserve"> invalid field in </w:t>
+      </w:r>
+      <w:proofErr w:type="spellStart"/>
+      <w:r>
+        <w:rPr>
+          <w:rFonts w:ascii="Times New Roman" w:hAnsi="Times New Roman" w:cs="Times New Roman"/>
+          <w:sz w:val="22"/>
+          <w:szCs w:val="22"/>
+        </w:rPr>
+        <w:t>invalidField</w:t>
+      </w:r>
+      <w:proofErr w:type="spellEnd"/>
+      <w:r>
+        <w:rPr>
+          <w:rFonts w:ascii="Times New Roman" w:hAnsi="Times New Roman" w:cs="Times New Roman"/>
+          <w:sz w:val="22"/>
+          <w:szCs w:val="22"/>
+        </w:rPr>
+        <w:t>, if one has not already been saved.</w:t>
       </w:r>
     </w:p>
     <w:p>
@@ -2535,7 +3055,25 @@
           <w:sz w:val="22"/>
           <w:szCs w:val="22"/>
         </w:rPr>
-        <w:t>- Connects the input to its error message using aria-describedby.</w:t>
+        <w:t>- Connects the input to its error message using aria-</w:t>
+      </w:r>
+      <w:proofErr w:type="spellStart"/>
+      <w:r>
+        <w:rPr>
+          <w:rFonts w:ascii="Times New Roman" w:hAnsi="Times New Roman" w:cs="Times New Roman"/>
+          <w:sz w:val="22"/>
+          <w:szCs w:val="22"/>
+        </w:rPr>
+        <w:t>describedby</w:t>
+      </w:r>
+      <w:proofErr w:type="spellEnd"/>
+      <w:r>
+        <w:rPr>
+          <w:rFonts w:ascii="Times New Roman" w:hAnsi="Times New Roman" w:cs="Times New Roman"/>
+          <w:sz w:val="22"/>
+          <w:szCs w:val="22"/>
+        </w:rPr>
+        <w:t>.</w:t>
       </w:r>
     </w:p>
     <w:p>
@@ -2554,7 +3092,25 @@
           <w:sz w:val="22"/>
           <w:szCs w:val="22"/>
         </w:rPr>
-        <w:t>- Displays the provided error message using error.textContent.</w:t>
+        <w:t xml:space="preserve">- Displays the provided error message using </w:t>
+      </w:r>
+      <w:proofErr w:type="spellStart"/>
+      <w:r>
+        <w:rPr>
+          <w:rFonts w:ascii="Times New Roman" w:hAnsi="Times New Roman" w:cs="Times New Roman"/>
+          <w:sz w:val="22"/>
+          <w:szCs w:val="22"/>
+        </w:rPr>
+        <w:t>error.textContent</w:t>
+      </w:r>
+      <w:proofErr w:type="spellEnd"/>
+      <w:r>
+        <w:rPr>
+          <w:rFonts w:ascii="Times New Roman" w:hAnsi="Times New Roman" w:cs="Times New Roman"/>
+          <w:sz w:val="22"/>
+          <w:szCs w:val="22"/>
+        </w:rPr>
+        <w:t>.</w:t>
       </w:r>
     </w:p>
     <w:p>
@@ -2606,13 +3162,23 @@
           <w:szCs w:val="22"/>
         </w:rPr>
       </w:pPr>
-      <w:r>
-        <w:rPr>
-          <w:rFonts w:ascii="Times New Roman" w:hAnsi="Times New Roman" w:cs="Times New Roman"/>
-          <w:sz w:val="22"/>
-          <w:szCs w:val="22"/>
-        </w:rPr>
-        <w:t>clearError(input, error)</w:t>
+      <w:proofErr w:type="spellStart"/>
+      <w:r>
+        <w:rPr>
+          <w:rFonts w:ascii="Times New Roman" w:hAnsi="Times New Roman" w:cs="Times New Roman"/>
+          <w:sz w:val="22"/>
+          <w:szCs w:val="22"/>
+        </w:rPr>
+        <w:t>clearError</w:t>
+      </w:r>
+      <w:proofErr w:type="spellEnd"/>
+      <w:r>
+        <w:rPr>
+          <w:rFonts w:ascii="Times New Roman" w:hAnsi="Times New Roman" w:cs="Times New Roman"/>
+          <w:sz w:val="22"/>
+          <w:szCs w:val="22"/>
+        </w:rPr>
+        <w:t>(input, error)</w:t>
       </w:r>
     </w:p>
     <w:p>
@@ -2631,7 +3197,25 @@
           <w:sz w:val="22"/>
           <w:szCs w:val="22"/>
         </w:rPr>
-        <w:t>This function clears an error after the input becomes valid. It sets aria-invalid to "false", removes aria-describedby, and empties the error message.</w:t>
+        <w:t>This function clears an error after the input becomes valid. It sets aria-invalid to "false", removes aria-</w:t>
+      </w:r>
+      <w:proofErr w:type="spellStart"/>
+      <w:r>
+        <w:rPr>
+          <w:rFonts w:ascii="Times New Roman" w:hAnsi="Times New Roman" w:cs="Times New Roman"/>
+          <w:sz w:val="22"/>
+          <w:szCs w:val="22"/>
+        </w:rPr>
+        <w:t>describedby</w:t>
+      </w:r>
+      <w:proofErr w:type="spellEnd"/>
+      <w:r>
+        <w:rPr>
+          <w:rFonts w:ascii="Times New Roman" w:hAnsi="Times New Roman" w:cs="Times New Roman"/>
+          <w:sz w:val="22"/>
+          <w:szCs w:val="22"/>
+        </w:rPr>
+        <w:t>, and empties the error message.</w:t>
       </w:r>
     </w:p>
     <w:p>
@@ -2730,7 +3314,43 @@
           <w:sz w:val="22"/>
           <w:szCs w:val="22"/>
         </w:rPr>
-        <w:t>Main function: calculateTotal(arr)</w:t>
+        <w:t xml:space="preserve">Main function: </w:t>
+      </w:r>
+      <w:proofErr w:type="spellStart"/>
+      <w:r>
+        <w:rPr>
+          <w:rFonts w:ascii="Times New Roman" w:hAnsi="Times New Roman" w:cs="Times New Roman"/>
+          <w:sz w:val="22"/>
+          <w:szCs w:val="22"/>
+        </w:rPr>
+        <w:t>calculateTotal</w:t>
+      </w:r>
+      <w:proofErr w:type="spellEnd"/>
+      <w:r>
+        <w:rPr>
+          <w:rFonts w:ascii="Times New Roman" w:hAnsi="Times New Roman" w:cs="Times New Roman"/>
+          <w:sz w:val="22"/>
+          <w:szCs w:val="22"/>
+        </w:rPr>
+        <w:t>(</w:t>
+      </w:r>
+      <w:proofErr w:type="spellStart"/>
+      <w:r>
+        <w:rPr>
+          <w:rFonts w:ascii="Times New Roman" w:hAnsi="Times New Roman" w:cs="Times New Roman"/>
+          <w:sz w:val="22"/>
+          <w:szCs w:val="22"/>
+        </w:rPr>
+        <w:t>arr</w:t>
+      </w:r>
+      <w:proofErr w:type="spellEnd"/>
+      <w:r>
+        <w:rPr>
+          <w:rFonts w:ascii="Times New Roman" w:hAnsi="Times New Roman" w:cs="Times New Roman"/>
+          <w:sz w:val="22"/>
+          <w:szCs w:val="22"/>
+        </w:rPr>
+        <w:t>)</w:t>
       </w:r>
     </w:p>
     <w:p>
@@ -2804,7 +3424,43 @@
           <w:sz w:val="22"/>
           <w:szCs w:val="22"/>
         </w:rPr>
-        <w:t>2. The function calculateTotal(inputGroup) receives an array containing the name, email, and message inputs.</w:t>
+        <w:t xml:space="preserve">2. The function </w:t>
+      </w:r>
+      <w:proofErr w:type="spellStart"/>
+      <w:r>
+        <w:rPr>
+          <w:rFonts w:ascii="Times New Roman" w:hAnsi="Times New Roman" w:cs="Times New Roman"/>
+          <w:sz w:val="22"/>
+          <w:szCs w:val="22"/>
+        </w:rPr>
+        <w:t>calculateTotal</w:t>
+      </w:r>
+      <w:proofErr w:type="spellEnd"/>
+      <w:r>
+        <w:rPr>
+          <w:rFonts w:ascii="Times New Roman" w:hAnsi="Times New Roman" w:cs="Times New Roman"/>
+          <w:sz w:val="22"/>
+          <w:szCs w:val="22"/>
+        </w:rPr>
+        <w:t>(</w:t>
+      </w:r>
+      <w:proofErr w:type="spellStart"/>
+      <w:r>
+        <w:rPr>
+          <w:rFonts w:ascii="Times New Roman" w:hAnsi="Times New Roman" w:cs="Times New Roman"/>
+          <w:sz w:val="22"/>
+          <w:szCs w:val="22"/>
+        </w:rPr>
+        <w:t>inputGroup</w:t>
+      </w:r>
+      <w:proofErr w:type="spellEnd"/>
+      <w:r>
+        <w:rPr>
+          <w:rFonts w:ascii="Times New Roman" w:hAnsi="Times New Roman" w:cs="Times New Roman"/>
+          <w:sz w:val="22"/>
+          <w:szCs w:val="22"/>
+        </w:rPr>
+        <w:t>) receives an array containing the name, email, and message inputs.</w:t>
       </w:r>
     </w:p>
     <w:p>
@@ -2842,7 +3498,25 @@
           <w:sz w:val="22"/>
           <w:szCs w:val="22"/>
         </w:rPr>
-        <w:t>4. liveCounter.textContent updates the displayed character count.</w:t>
+        <w:t xml:space="preserve">4. </w:t>
+      </w:r>
+      <w:proofErr w:type="spellStart"/>
+      <w:r>
+        <w:rPr>
+          <w:rFonts w:ascii="Times New Roman" w:hAnsi="Times New Roman" w:cs="Times New Roman"/>
+          <w:sz w:val="22"/>
+          <w:szCs w:val="22"/>
+        </w:rPr>
+        <w:t>liveCounter.textContent</w:t>
+      </w:r>
+      <w:proofErr w:type="spellEnd"/>
+      <w:r>
+        <w:rPr>
+          <w:rFonts w:ascii="Times New Roman" w:hAnsi="Times New Roman" w:cs="Times New Roman"/>
+          <w:sz w:val="22"/>
+          <w:szCs w:val="22"/>
+        </w:rPr>
+        <w:t xml:space="preserve"> updates the displayed character count.</w:t>
       </w:r>
     </w:p>
     <w:p>
@@ -3203,15 +3877,27 @@
         <w:lastRenderedPageBreak/>
         <w:t>I researched different functions which could aid to my problem and after a short time I came across the “</w:t>
       </w:r>
-      <w:hyperlink r:id="rId20" w:history="1">
-        <w:r>
-          <w:rPr>
-            <w:rStyle w:val="Hyperlink"/>
-            <w:rFonts w:ascii="Times New Roman" w:hAnsi="Times New Roman" w:cs="Times New Roman"/>
-          </w:rPr>
-          <w:t>insertAdjacentHTML</w:t>
-        </w:r>
-      </w:hyperlink>
+      <w:proofErr w:type="spellStart"/>
+      <w:r>
+        <w:fldChar w:fldCharType="begin"/>
+      </w:r>
+      <w:r>
+        <w:instrText>HYPERLINK "https://developer.mozilla.org/es/docs/Web/API/Element/insertAdjacentHTML"</w:instrText>
+      </w:r>
+      <w:r>
+        <w:fldChar w:fldCharType="separate"/>
+      </w:r>
+      <w:r>
+        <w:rPr>
+          <w:rStyle w:val="Hyperlink"/>
+          <w:rFonts w:ascii="Times New Roman" w:hAnsi="Times New Roman" w:cs="Times New Roman"/>
+        </w:rPr>
+        <w:t>insertAdjacentHTML</w:t>
+      </w:r>
+      <w:proofErr w:type="spellEnd"/>
+      <w:r>
+        <w:fldChar w:fldCharType="end"/>
+      </w:r>
       <w:r>
         <w:rPr>
           <w:rFonts w:ascii="Times New Roman" w:hAnsi="Times New Roman" w:cs="Times New Roman"/>
@@ -3460,13 +4146,23 @@
                 <w:szCs w:val="20"/>
               </w:rPr>
             </w:pPr>
+            <w:proofErr w:type="spellStart"/>
             <w:r>
               <w:rPr>
                 <w:rFonts w:ascii="Times New Roman" w:hAnsi="Times New Roman" w:cs="Times New Roman"/>
                 <w:sz w:val="20"/>
                 <w:szCs w:val="20"/>
               </w:rPr>
-              <w:t>clickAndShow()</w:t>
+              <w:t>clickAndShow</w:t>
+            </w:r>
+            <w:proofErr w:type="spellEnd"/>
+            <w:r>
+              <w:rPr>
+                <w:rFonts w:ascii="Times New Roman" w:hAnsi="Times New Roman" w:cs="Times New Roman"/>
+                <w:sz w:val="20"/>
+                <w:szCs w:val="20"/>
+              </w:rPr>
+              <w:t>()</w:t>
             </w:r>
           </w:p>
         </w:tc>
@@ -3563,13 +4259,23 @@
                 <w:szCs w:val="20"/>
               </w:rPr>
             </w:pPr>
+            <w:proofErr w:type="spellStart"/>
             <w:r>
               <w:rPr>
                 <w:rFonts w:ascii="Times New Roman" w:hAnsi="Times New Roman" w:cs="Times New Roman"/>
                 <w:sz w:val="20"/>
                 <w:szCs w:val="20"/>
               </w:rPr>
-              <w:t>calculateTotal()</w:t>
+              <w:t>calculateTotal</w:t>
+            </w:r>
+            <w:proofErr w:type="spellEnd"/>
+            <w:r>
+              <w:rPr>
+                <w:rFonts w:ascii="Times New Roman" w:hAnsi="Times New Roman" w:cs="Times New Roman"/>
+                <w:sz w:val="20"/>
+                <w:szCs w:val="20"/>
+              </w:rPr>
+              <w:t>()</w:t>
             </w:r>
           </w:p>
         </w:tc>
@@ -3690,13 +4396,23 @@
                 <w:szCs w:val="20"/>
               </w:rPr>
             </w:pPr>
+            <w:proofErr w:type="spellStart"/>
             <w:r>
               <w:rPr>
                 <w:rFonts w:ascii="Times New Roman" w:hAnsi="Times New Roman" w:cs="Times New Roman"/>
                 <w:sz w:val="20"/>
                 <w:szCs w:val="20"/>
               </w:rPr>
-              <w:t>setError()</w:t>
+              <w:t>setError</w:t>
+            </w:r>
+            <w:proofErr w:type="spellEnd"/>
+            <w:r>
+              <w:rPr>
+                <w:rFonts w:ascii="Times New Roman" w:hAnsi="Times New Roman" w:cs="Times New Roman"/>
+                <w:sz w:val="20"/>
+                <w:szCs w:val="20"/>
+              </w:rPr>
+              <w:t>()</w:t>
             </w:r>
           </w:p>
           <w:p>
@@ -3708,13 +4424,23 @@
                 <w:szCs w:val="20"/>
               </w:rPr>
             </w:pPr>
+            <w:proofErr w:type="spellStart"/>
             <w:r>
               <w:rPr>
                 <w:rFonts w:ascii="Times New Roman" w:hAnsi="Times New Roman" w:cs="Times New Roman"/>
                 <w:sz w:val="20"/>
                 <w:szCs w:val="20"/>
               </w:rPr>
-              <w:t>clearError()</w:t>
+              <w:t>clearError</w:t>
+            </w:r>
+            <w:proofErr w:type="spellEnd"/>
+            <w:r>
+              <w:rPr>
+                <w:rFonts w:ascii="Times New Roman" w:hAnsi="Times New Roman" w:cs="Times New Roman"/>
+                <w:sz w:val="20"/>
+                <w:szCs w:val="20"/>
+              </w:rPr>
+              <w:t>()</w:t>
             </w:r>
           </w:p>
         </w:tc>
@@ -4266,7 +4992,25 @@
                 <w:sz w:val="20"/>
                 <w:szCs w:val="20"/>
               </w:rPr>
-              <w:t>Callback inside setTimeout()</w:t>
+              <w:t xml:space="preserve">Callback inside </w:t>
+            </w:r>
+            <w:proofErr w:type="spellStart"/>
+            <w:r>
+              <w:rPr>
+                <w:rFonts w:ascii="Times New Roman" w:hAnsi="Times New Roman" w:cs="Times New Roman"/>
+                <w:sz w:val="20"/>
+                <w:szCs w:val="20"/>
+              </w:rPr>
+              <w:t>setTimeout</w:t>
+            </w:r>
+            <w:proofErr w:type="spellEnd"/>
+            <w:r>
+              <w:rPr>
+                <w:rFonts w:ascii="Times New Roman" w:hAnsi="Times New Roman" w:cs="Times New Roman"/>
+                <w:sz w:val="20"/>
+                <w:szCs w:val="20"/>
+              </w:rPr>
+              <w:t>()</w:t>
             </w:r>
           </w:p>
         </w:tc>
@@ -4442,16 +5186,26 @@
           <w:b/>
           <w:bCs/>
         </w:rPr>
-        <w:t xml:space="preserve"> evidence</w:t>
-      </w:r>
+        <w:t xml:space="preserve"> </w:t>
+      </w:r>
+      <w:proofErr w:type="gramStart"/>
       <w:r>
         <w:rPr>
           <w:rFonts w:ascii="Times New Roman" w:hAnsi="Times New Roman" w:cs="Times New Roman"/>
           <w:b/>
           <w:bCs/>
         </w:rPr>
+        <w:t>evidence</w:t>
+      </w:r>
+      <w:r>
+        <w:rPr>
+          <w:rFonts w:ascii="Times New Roman" w:hAnsi="Times New Roman" w:cs="Times New Roman"/>
+          <w:b/>
+          <w:bCs/>
+        </w:rPr>
         <w:t>s</w:t>
       </w:r>
+      <w:proofErr w:type="gramEnd"/>
       <w:r>
         <w:rPr>
           <w:rFonts w:ascii="Times New Roman" w:hAnsi="Times New Roman" w:cs="Times New Roman"/>
@@ -4578,7 +5332,7 @@
                     <pic:cNvPicPr/>
                   </pic:nvPicPr>
                   <pic:blipFill>
-                    <a:blip r:embed="rId21"/>
+                    <a:blip r:embed="rId20"/>
                     <a:stretch>
                       <a:fillRect/>
                     </a:stretch>
@@ -4609,7 +5363,35 @@
         <w:rPr>
           <w:rFonts w:ascii="Times New Roman" w:hAnsi="Times New Roman" w:cs="Times New Roman"/>
         </w:rPr>
-        <w:t>I misspelled the function, after correcting input.setAttibute to input.setAttribute things worked as supposed to.</w:t>
+        <w:t xml:space="preserve">I misspelled the function, after correcting </w:t>
+      </w:r>
+      <w:proofErr w:type="spellStart"/>
+      <w:r>
+        <w:rPr>
+          <w:rFonts w:ascii="Times New Roman" w:hAnsi="Times New Roman" w:cs="Times New Roman"/>
+        </w:rPr>
+        <w:t>input.setAttibute</w:t>
+      </w:r>
+      <w:proofErr w:type="spellEnd"/>
+      <w:r>
+        <w:rPr>
+          <w:rFonts w:ascii="Times New Roman" w:hAnsi="Times New Roman" w:cs="Times New Roman"/>
+        </w:rPr>
+        <w:t xml:space="preserve"> to </w:t>
+      </w:r>
+      <w:proofErr w:type="spellStart"/>
+      <w:r>
+        <w:rPr>
+          <w:rFonts w:ascii="Times New Roman" w:hAnsi="Times New Roman" w:cs="Times New Roman"/>
+        </w:rPr>
+        <w:t>input.setAttribute</w:t>
+      </w:r>
+      <w:proofErr w:type="spellEnd"/>
+      <w:r>
+        <w:rPr>
+          <w:rFonts w:ascii="Times New Roman" w:hAnsi="Times New Roman" w:cs="Times New Roman"/>
+        </w:rPr>
+        <w:t xml:space="preserve"> things worked as supposed to.</w:t>
       </w:r>
     </w:p>
     <w:p>
@@ -4640,6 +5422,7 @@
       <w:r>
         <w:rPr>
           <w:rFonts w:ascii="Times New Roman" w:hAnsi="Times New Roman" w:cs="Times New Roman"/>
+          <w:noProof/>
         </w:rPr>
         <w:drawing>
           <wp:inline distT="0" distB="0" distL="0" distR="0" wp14:anchorId="56ADCFEB" wp14:editId="69C1AF91">
@@ -4657,7 +5440,7 @@
                     <pic:cNvPicPr/>
                   </pic:nvPicPr>
                   <pic:blipFill rotWithShape="1">
-                    <a:blip r:embed="rId22"/>
+                    <a:blip r:embed="rId21"/>
                     <a:srcRect t="8746"/>
                     <a:stretch>
                       <a:fillRect/>
@@ -4689,6 +5472,7 @@
       <w:r>
         <w:rPr>
           <w:rFonts w:ascii="Times New Roman" w:hAnsi="Times New Roman" w:cs="Times New Roman"/>
+          <w:noProof/>
         </w:rPr>
         <w:drawing>
           <wp:inline distT="0" distB="0" distL="0" distR="0" wp14:anchorId="2AC9BA49" wp14:editId="32A28D27">
@@ -4706,7 +5490,7 @@
                     <pic:cNvPicPr/>
                   </pic:nvPicPr>
                   <pic:blipFill>
-                    <a:blip r:embed="rId23"/>
+                    <a:blip r:embed="rId22"/>
                     <a:stretch>
                       <a:fillRect/>
                     </a:stretch>
@@ -4737,7 +5521,21 @@
         <w:rPr>
           <w:rFonts w:ascii="Times New Roman" w:hAnsi="Times New Roman" w:cs="Times New Roman"/>
         </w:rPr>
-        <w:t>This commit shows the key change I had to make on the html for the size changer buttons to work, I had missed that the key in the fontSizes array had to match the data-text-size value since that was the reference I used to assign the size.</w:t>
+        <w:t xml:space="preserve">This commit shows the key change I had to make on the html for the size changer buttons to work, I had missed that the key in the </w:t>
+      </w:r>
+      <w:proofErr w:type="spellStart"/>
+      <w:r>
+        <w:rPr>
+          <w:rFonts w:ascii="Times New Roman" w:hAnsi="Times New Roman" w:cs="Times New Roman"/>
+        </w:rPr>
+        <w:t>fontSizes</w:t>
+      </w:r>
+      <w:proofErr w:type="spellEnd"/>
+      <w:r>
+        <w:rPr>
+          <w:rFonts w:ascii="Times New Roman" w:hAnsi="Times New Roman" w:cs="Times New Roman"/>
+        </w:rPr>
+        <w:t xml:space="preserve"> array had to match the data-text-size value since that was the reference I used to assign the size.</w:t>
       </w:r>
     </w:p>
     <w:p>
@@ -4750,6 +5548,7 @@
       <w:r>
         <w:rPr>
           <w:rFonts w:ascii="Times New Roman" w:hAnsi="Times New Roman" w:cs="Times New Roman"/>
+          <w:noProof/>
         </w:rPr>
         <w:drawing>
           <wp:inline distT="0" distB="0" distL="0" distR="0" wp14:anchorId="6E3249D7" wp14:editId="4BE3AAF2">
@@ -4767,7 +5566,7 @@
                     <pic:cNvPicPr/>
                   </pic:nvPicPr>
                   <pic:blipFill rotWithShape="1">
-                    <a:blip r:embed="rId24"/>
+                    <a:blip r:embed="rId23"/>
                     <a:srcRect t="18952"/>
                     <a:stretch>
                       <a:fillRect/>
@@ -4861,7 +5660,7 @@
                     <pic:cNvPicPr/>
                   </pic:nvPicPr>
                   <pic:blipFill>
-                    <a:blip r:embed="rId25"/>
+                    <a:blip r:embed="rId24"/>
                     <a:stretch>
                       <a:fillRect/>
                     </a:stretch>
@@ -4928,7 +5727,7 @@
                     <pic:cNvPicPr/>
                   </pic:nvPicPr>
                   <pic:blipFill>
-                    <a:blip r:embed="rId26"/>
+                    <a:blip r:embed="rId25"/>
                     <a:stretch>
                       <a:fillRect/>
                     </a:stretch>
@@ -4994,7 +5793,7 @@
                     <pic:cNvPicPr/>
                   </pic:nvPicPr>
                   <pic:blipFill>
-                    <a:blip r:embed="rId27"/>
+                    <a:blip r:embed="rId26"/>
                     <a:stretch>
                       <a:fillRect/>
                     </a:stretch>
@@ -5105,12 +5904,14 @@
         </w:rPr>
         <w:t xml:space="preserve"> </w:t>
       </w:r>
+      <w:proofErr w:type="spellStart"/>
       <w:r>
         <w:rPr>
           <w:rFonts w:ascii="Times New Roman" w:hAnsi="Times New Roman" w:cs="Times New Roman"/>
         </w:rPr>
         <w:t>yearsExperience</w:t>
       </w:r>
+      <w:proofErr w:type="spellEnd"/>
       <w:r>
         <w:rPr>
           <w:rFonts w:ascii="Times New Roman" w:hAnsi="Times New Roman" w:cs="Times New Roman"/>
@@ -5121,8 +5922,16 @@
         <w:rPr>
           <w:rFonts w:ascii="Times New Roman" w:hAnsi="Times New Roman" w:cs="Times New Roman"/>
         </w:rPr>
-        <w:t>description, img</w:t>
-      </w:r>
+        <w:t xml:space="preserve">description, </w:t>
+      </w:r>
+      <w:proofErr w:type="spellStart"/>
+      <w:r>
+        <w:rPr>
+          <w:rFonts w:ascii="Times New Roman" w:hAnsi="Times New Roman" w:cs="Times New Roman"/>
+        </w:rPr>
+        <w:t>img</w:t>
+      </w:r>
+      <w:proofErr w:type="spellEnd"/>
       <w:r>
         <w:rPr>
           <w:rFonts w:ascii="Times New Roman" w:hAnsi="Times New Roman" w:cs="Times New Roman"/>
@@ -5152,14 +5961,30 @@
         <w:rPr>
           <w:rFonts w:ascii="Times New Roman" w:hAnsi="Times New Roman" w:cs="Times New Roman"/>
         </w:rPr>
-        <w:t>The cardGenerator(</w:t>
-      </w:r>
+        <w:t xml:space="preserve">The </w:t>
+      </w:r>
+      <w:proofErr w:type="spellStart"/>
+      <w:r>
+        <w:rPr>
+          <w:rFonts w:ascii="Times New Roman" w:hAnsi="Times New Roman" w:cs="Times New Roman"/>
+        </w:rPr>
+        <w:t>cardGenerator</w:t>
+      </w:r>
+      <w:proofErr w:type="spellEnd"/>
+      <w:r>
+        <w:rPr>
+          <w:rFonts w:ascii="Times New Roman" w:hAnsi="Times New Roman" w:cs="Times New Roman"/>
+        </w:rPr>
+        <w:t>(</w:t>
+      </w:r>
+      <w:proofErr w:type="spellStart"/>
       <w:r>
         <w:rPr>
           <w:rFonts w:ascii="Times New Roman" w:hAnsi="Times New Roman" w:cs="Times New Roman"/>
         </w:rPr>
         <w:t>arr</w:t>
       </w:r>
+      <w:proofErr w:type="spellEnd"/>
       <w:r>
         <w:rPr>
           <w:rFonts w:ascii="Times New Roman" w:hAnsi="Times New Roman" w:cs="Times New Roman"/>
@@ -5176,7 +6001,49 @@
         <w:rPr>
           <w:rFonts w:ascii="Times New Roman" w:hAnsi="Times New Roman" w:cs="Times New Roman"/>
         </w:rPr>
-        <w:t>clears the card container, then loops through the array and creates a card for each item. It fills each card with the skill’s details, adds it to the page, and displays five star icons, filling as many as the skill’s proficiency rating. After rendering, it calls updateCards(arr)</w:t>
+        <w:t xml:space="preserve">clears the card container, then loops through the array and creates a card for each item. It fills each card with the skill’s details, adds it to the page, and displays </w:t>
+      </w:r>
+      <w:proofErr w:type="gramStart"/>
+      <w:r>
+        <w:rPr>
+          <w:rFonts w:ascii="Times New Roman" w:hAnsi="Times New Roman" w:cs="Times New Roman"/>
+        </w:rPr>
+        <w:t>five star</w:t>
+      </w:r>
+      <w:proofErr w:type="gramEnd"/>
+      <w:r>
+        <w:rPr>
+          <w:rFonts w:ascii="Times New Roman" w:hAnsi="Times New Roman" w:cs="Times New Roman"/>
+        </w:rPr>
+        <w:t xml:space="preserve"> icons, filling as many as the skill’s proficiency rating. After rendering, it calls </w:t>
+      </w:r>
+      <w:proofErr w:type="spellStart"/>
+      <w:r>
+        <w:rPr>
+          <w:rFonts w:ascii="Times New Roman" w:hAnsi="Times New Roman" w:cs="Times New Roman"/>
+        </w:rPr>
+        <w:t>updateCards</w:t>
+      </w:r>
+      <w:proofErr w:type="spellEnd"/>
+      <w:r>
+        <w:rPr>
+          <w:rFonts w:ascii="Times New Roman" w:hAnsi="Times New Roman" w:cs="Times New Roman"/>
+        </w:rPr>
+        <w:t>(</w:t>
+      </w:r>
+      <w:proofErr w:type="spellStart"/>
+      <w:r>
+        <w:rPr>
+          <w:rFonts w:ascii="Times New Roman" w:hAnsi="Times New Roman" w:cs="Times New Roman"/>
+        </w:rPr>
+        <w:t>arr</w:t>
+      </w:r>
+      <w:proofErr w:type="spellEnd"/>
+      <w:r>
+        <w:rPr>
+          <w:rFonts w:ascii="Times New Roman" w:hAnsi="Times New Roman" w:cs="Times New Roman"/>
+        </w:rPr>
+        <w:t>)</w:t>
       </w:r>
       <w:r>
         <w:rPr>
@@ -5188,7 +6055,21 @@
         <w:rPr>
           <w:rFonts w:ascii="Times New Roman" w:hAnsi="Times New Roman" w:cs="Times New Roman"/>
         </w:rPr>
-        <w:t>saves the displayed items in currentCards and updates the skill counter to show how many items are displayed. This keeps the page’s data and count in sync</w:t>
+        <w:t xml:space="preserve">saves the displayed items in </w:t>
+      </w:r>
+      <w:proofErr w:type="spellStart"/>
+      <w:r>
+        <w:rPr>
+          <w:rFonts w:ascii="Times New Roman" w:hAnsi="Times New Roman" w:cs="Times New Roman"/>
+        </w:rPr>
+        <w:t>currentCards</w:t>
+      </w:r>
+      <w:proofErr w:type="spellEnd"/>
+      <w:r>
+        <w:rPr>
+          <w:rFonts w:ascii="Times New Roman" w:hAnsi="Times New Roman" w:cs="Times New Roman"/>
+        </w:rPr>
+        <w:t xml:space="preserve"> and updates the skill counter to show how many items are displayed. This keeps the page’s data and count in sync</w:t>
       </w:r>
       <w:r>
         <w:rPr>
@@ -5222,7 +6103,19 @@
           <w:rFonts w:ascii="Times New Roman" w:hAnsi="Times New Roman" w:cs="Times New Roman"/>
         </w:rPr>
         <w:lastRenderedPageBreak/>
-        <w:t>Size buttons:</w:t>
+        <w:t>Size buttons</w:t>
+      </w:r>
+      <w:r>
+        <w:rPr>
+          <w:rFonts w:ascii="Times New Roman" w:hAnsi="Times New Roman" w:cs="Times New Roman"/>
+        </w:rPr>
+        <w:t xml:space="preserve"> working proof</w:t>
+      </w:r>
+      <w:r>
+        <w:rPr>
+          <w:rFonts w:ascii="Times New Roman" w:hAnsi="Times New Roman" w:cs="Times New Roman"/>
+        </w:rPr>
+        <w:t>:</w:t>
       </w:r>
     </w:p>
     <w:p>
@@ -5253,6 +6146,7 @@
       <w:r>
         <w:rPr>
           <w:rFonts w:ascii="Times New Roman" w:hAnsi="Times New Roman" w:cs="Times New Roman"/>
+          <w:noProof/>
         </w:rPr>
         <w:drawing>
           <wp:inline distT="0" distB="0" distL="0" distR="0" wp14:anchorId="77D54A97" wp14:editId="3BC2E532">
@@ -5270,7 +6164,7 @@
                     <pic:cNvPicPr/>
                   </pic:nvPicPr>
                   <pic:blipFill rotWithShape="1">
-                    <a:blip r:embed="rId28"/>
+                    <a:blip r:embed="rId27"/>
                     <a:srcRect t="6519"/>
                     <a:stretch>
                       <a:fillRect/>
@@ -5328,6 +6222,7 @@
       <w:r>
         <w:rPr>
           <w:rFonts w:ascii="Times New Roman" w:hAnsi="Times New Roman" w:cs="Times New Roman"/>
+          <w:noProof/>
         </w:rPr>
         <w:drawing>
           <wp:inline distT="0" distB="0" distL="0" distR="0" wp14:anchorId="700C36AC" wp14:editId="4ED8DC7A">
@@ -5345,7 +6240,7 @@
                     <pic:cNvPicPr/>
                   </pic:nvPicPr>
                   <pic:blipFill rotWithShape="1">
-                    <a:blip r:embed="rId29"/>
+                    <a:blip r:embed="rId28"/>
                     <a:srcRect t="9436"/>
                     <a:stretch>
                       <a:fillRect/>
@@ -5403,6 +6298,7 @@
       <w:r>
         <w:rPr>
           <w:rFonts w:ascii="Times New Roman" w:hAnsi="Times New Roman" w:cs="Times New Roman"/>
+          <w:noProof/>
         </w:rPr>
         <w:drawing>
           <wp:inline distT="0" distB="0" distL="0" distR="0" wp14:anchorId="2C9D30B0" wp14:editId="2D87BB18">
@@ -5420,7 +6316,7 @@
                     <pic:cNvPicPr/>
                   </pic:nvPicPr>
                   <pic:blipFill rotWithShape="1">
-                    <a:blip r:embed="rId30"/>
+                    <a:blip r:embed="rId29"/>
                     <a:srcRect t="11885"/>
                     <a:stretch>
                       <a:fillRect/>
@@ -5475,25 +6371,21 @@
       <w:r>
         <w:rPr>
           <w:rFonts w:ascii="Times New Roman" w:hAnsi="Times New Roman" w:cs="Times New Roman"/>
+          <w:noProof/>
         </w:rPr>
         <w:lastRenderedPageBreak/>
-        <w:t>Saved size:</w:t>
-      </w:r>
-    </w:p>
-    <w:p>
-      <w:pPr>
-        <w:rPr>
-          <w:rFonts w:ascii="Times New Roman" w:hAnsi="Times New Roman" w:cs="Times New Roman"/>
-        </w:rPr>
-      </w:pPr>
-      <w:r>
-        <w:rPr>
-          <w:rFonts w:ascii="Times New Roman" w:hAnsi="Times New Roman" w:cs="Times New Roman"/>
-        </w:rPr>
         <w:drawing>
-          <wp:inline distT="0" distB="0" distL="0" distR="0" wp14:anchorId="3066915D" wp14:editId="69E365FD">
+          <wp:anchor distT="0" distB="0" distL="114300" distR="114300" simplePos="0" relativeHeight="251660288" behindDoc="0" locked="0" layoutInCell="1" allowOverlap="1" wp14:anchorId="3066915D" wp14:editId="76BA9404">
+            <wp:simplePos x="0" y="0"/>
+            <wp:positionH relativeFrom="column">
+              <wp:posOffset>1837691</wp:posOffset>
+            </wp:positionH>
+            <wp:positionV relativeFrom="paragraph">
+              <wp:posOffset>0</wp:posOffset>
+            </wp:positionV>
             <wp:extent cx="4286848" cy="1810003"/>
             <wp:effectExtent l="0" t="0" r="0" b="0"/>
+            <wp:wrapSquare wrapText="bothSides"/>
             <wp:docPr id="1991059461" name="Picture 1"/>
             <wp:cNvGraphicFramePr>
               <a:graphicFrameLocks xmlns:a="http://schemas.openxmlformats.org/drawingml/2006/main" noChangeAspect="1"/>
@@ -5506,7 +6398,13 @@
                     <pic:cNvPicPr/>
                   </pic:nvPicPr>
                   <pic:blipFill>
-                    <a:blip r:embed="rId31"/>
+                    <a:blip r:embed="rId30">
+                      <a:extLst>
+                        <a:ext uri="{28A0092B-C50C-407E-A947-70E740481C1C}">
+                          <a14:useLocalDpi xmlns:a14="http://schemas.microsoft.com/office/drawing/2010/main" val="0"/>
+                        </a:ext>
+                      </a:extLst>
+                    </a:blip>
                     <a:stretch>
                       <a:fillRect/>
                     </a:stretch>
@@ -5523,19 +6421,45 @@
                 </pic:pic>
               </a:graphicData>
             </a:graphic>
-          </wp:inline>
+          </wp:anchor>
         </w:drawing>
       </w:r>
-    </w:p>
-    <w:p>
-      <w:pPr>
-        <w:rPr>
-          <w:rFonts w:ascii="Times New Roman" w:hAnsi="Times New Roman" w:cs="Times New Roman"/>
-        </w:rPr>
-      </w:pPr>
-      <w:r>
-        <w:rPr>
-          <w:rFonts w:ascii="Times New Roman" w:hAnsi="Times New Roman" w:cs="Times New Roman"/>
+      <w:r>
+        <w:rPr>
+          <w:rFonts w:ascii="Times New Roman" w:hAnsi="Times New Roman" w:cs="Times New Roman"/>
+        </w:rPr>
+        <w:t>Saved size</w:t>
+      </w:r>
+      <w:r>
+        <w:rPr>
+          <w:rFonts w:ascii="Times New Roman" w:hAnsi="Times New Roman" w:cs="Times New Roman"/>
+        </w:rPr>
+        <w:t xml:space="preserve"> proof</w:t>
+      </w:r>
+      <w:r>
+        <w:rPr>
+          <w:rFonts w:ascii="Times New Roman" w:hAnsi="Times New Roman" w:cs="Times New Roman"/>
+        </w:rPr>
+        <w:t>:</w:t>
+      </w:r>
+    </w:p>
+    <w:p>
+      <w:pPr>
+        <w:rPr>
+          <w:rFonts w:ascii="Times New Roman" w:hAnsi="Times New Roman" w:cs="Times New Roman"/>
+        </w:rPr>
+      </w:pPr>
+    </w:p>
+    <w:p>
+      <w:pPr>
+        <w:rPr>
+          <w:rFonts w:ascii="Times New Roman" w:hAnsi="Times New Roman" w:cs="Times New Roman"/>
+        </w:rPr>
+      </w:pPr>
+      <w:r>
+        <w:rPr>
+          <w:rFonts w:ascii="Times New Roman" w:hAnsi="Times New Roman" w:cs="Times New Roman"/>
+          <w:noProof/>
         </w:rPr>
         <w:drawing>
           <wp:inline distT="0" distB="0" distL="0" distR="0" wp14:anchorId="6B174EA5" wp14:editId="7B94A02D">
@@ -5553,7 +6477,7 @@
                     <pic:cNvPicPr/>
                   </pic:nvPicPr>
                   <pic:blipFill>
-                    <a:blip r:embed="rId32"/>
+                    <a:blip r:embed="rId31"/>
                     <a:stretch>
                       <a:fillRect/>
                     </a:stretch>
@@ -5583,6 +6507,7 @@
       <w:r>
         <w:rPr>
           <w:rFonts w:ascii="Times New Roman" w:hAnsi="Times New Roman" w:cs="Times New Roman"/>
+          <w:noProof/>
         </w:rPr>
         <w:drawing>
           <wp:inline distT="0" distB="0" distL="0" distR="0" wp14:anchorId="192C5614" wp14:editId="707BD36E">
@@ -5600,7 +6525,7 @@
                     <pic:cNvPicPr/>
                   </pic:nvPicPr>
                   <pic:blipFill>
-                    <a:blip r:embed="rId33"/>
+                    <a:blip r:embed="rId32"/>
                     <a:stretch>
                       <a:fillRect/>
                     </a:stretch>
@@ -5620,6 +6545,845 @@
           </wp:inline>
         </w:drawing>
       </w:r>
+    </w:p>
+    <w:p>
+      <w:pPr>
+        <w:spacing w:after="0"/>
+        <w:rPr>
+          <w:rFonts w:ascii="Times New Roman" w:hAnsi="Times New Roman" w:cs="Times New Roman"/>
+        </w:rPr>
+      </w:pPr>
+    </w:p>
+    <w:p>
+      <w:pPr>
+        <w:rPr>
+          <w:rFonts w:ascii="Times New Roman" w:hAnsi="Times New Roman" w:cs="Times New Roman"/>
+        </w:rPr>
+      </w:pPr>
+      <w:r>
+        <w:rPr>
+          <w:rFonts w:ascii="Times New Roman" w:hAnsi="Times New Roman" w:cs="Times New Roman"/>
+        </w:rPr>
+        <w:t xml:space="preserve">In the default view, the website uses its </w:t>
+      </w:r>
+      <w:r>
+        <w:rPr>
+          <w:rFonts w:ascii="Times New Roman" w:hAnsi="Times New Roman" w:cs="Times New Roman"/>
+        </w:rPr>
+        <w:t>medium (M)</w:t>
+      </w:r>
+      <w:r>
+        <w:rPr>
+          <w:rFonts w:ascii="Times New Roman" w:hAnsi="Times New Roman" w:cs="Times New Roman"/>
+        </w:rPr>
+        <w:t xml:space="preserve"> text size and</w:t>
+      </w:r>
+      <w:r>
+        <w:rPr>
+          <w:rFonts w:ascii="Times New Roman" w:hAnsi="Times New Roman" w:cs="Times New Roman"/>
+        </w:rPr>
+        <w:t xml:space="preserve"> normal</w:t>
+      </w:r>
+      <w:r>
+        <w:rPr>
+          <w:rFonts w:ascii="Times New Roman" w:hAnsi="Times New Roman" w:cs="Times New Roman"/>
+        </w:rPr>
+        <w:t xml:space="preserve"> </w:t>
+      </w:r>
+      <w:proofErr w:type="spellStart"/>
+      <w:r>
+        <w:rPr>
+          <w:rFonts w:ascii="Times New Roman" w:hAnsi="Times New Roman" w:cs="Times New Roman"/>
+        </w:rPr>
+        <w:t>color</w:t>
+      </w:r>
+      <w:proofErr w:type="spellEnd"/>
+      <w:r>
+        <w:rPr>
+          <w:rFonts w:ascii="Times New Roman" w:hAnsi="Times New Roman" w:cs="Times New Roman"/>
+        </w:rPr>
+        <w:t xml:space="preserve"> theme. With </w:t>
+      </w:r>
+      <w:r>
+        <w:rPr>
+          <w:rFonts w:ascii="Times New Roman" w:hAnsi="Times New Roman" w:cs="Times New Roman"/>
+          <w:b/>
+          <w:bCs/>
+        </w:rPr>
+        <w:t>Large</w:t>
+      </w:r>
+      <w:r>
+        <w:rPr>
+          <w:rFonts w:ascii="Times New Roman" w:hAnsi="Times New Roman" w:cs="Times New Roman"/>
+        </w:rPr>
+        <w:t xml:space="preserve"> text and </w:t>
+      </w:r>
+      <w:r>
+        <w:rPr>
+          <w:rFonts w:ascii="Times New Roman" w:hAnsi="Times New Roman" w:cs="Times New Roman"/>
+          <w:b/>
+          <w:bCs/>
+        </w:rPr>
+        <w:t>High Contrast</w:t>
+      </w:r>
+      <w:r>
+        <w:rPr>
+          <w:rFonts w:ascii="Times New Roman" w:hAnsi="Times New Roman" w:cs="Times New Roman"/>
+        </w:rPr>
+        <w:t xml:space="preserve"> enabled, the text becomes larger and the high-contrast </w:t>
+      </w:r>
+      <w:proofErr w:type="spellStart"/>
+      <w:r>
+        <w:rPr>
+          <w:rFonts w:ascii="Times New Roman" w:hAnsi="Times New Roman" w:cs="Times New Roman"/>
+        </w:rPr>
+        <w:t>color</w:t>
+      </w:r>
+      <w:proofErr w:type="spellEnd"/>
+      <w:r>
+        <w:rPr>
+          <w:rFonts w:ascii="Times New Roman" w:hAnsi="Times New Roman" w:cs="Times New Roman"/>
+        </w:rPr>
+        <w:t xml:space="preserve"> variables are applied</w:t>
+      </w:r>
+      <w:r>
+        <w:rPr>
+          <w:rFonts w:ascii="Times New Roman" w:hAnsi="Times New Roman" w:cs="Times New Roman"/>
+        </w:rPr>
+        <w:t>.</w:t>
+      </w:r>
+      <w:r>
+        <w:rPr>
+          <w:rFonts w:ascii="Times New Roman" w:hAnsi="Times New Roman" w:cs="Times New Roman"/>
+        </w:rPr>
+        <w:t xml:space="preserve"> The layout stays the same, while the text size and </w:t>
+      </w:r>
+      <w:proofErr w:type="spellStart"/>
+      <w:r>
+        <w:rPr>
+          <w:rFonts w:ascii="Times New Roman" w:hAnsi="Times New Roman" w:cs="Times New Roman"/>
+        </w:rPr>
+        <w:t>colors</w:t>
+      </w:r>
+      <w:proofErr w:type="spellEnd"/>
+      <w:r>
+        <w:rPr>
+          <w:rFonts w:ascii="Times New Roman" w:hAnsi="Times New Roman" w:cs="Times New Roman"/>
+        </w:rPr>
+        <w:t xml:space="preserve"> change</w:t>
+      </w:r>
+      <w:r>
+        <w:rPr>
+          <w:rFonts w:ascii="Times New Roman" w:hAnsi="Times New Roman" w:cs="Times New Roman"/>
+        </w:rPr>
+        <w:t>:</w:t>
+      </w:r>
+    </w:p>
+    <w:p>
+      <w:pPr>
+        <w:rPr>
+          <w:rFonts w:ascii="Times New Roman" w:hAnsi="Times New Roman" w:cs="Times New Roman"/>
+        </w:rPr>
+      </w:pPr>
+      <w:r>
+        <w:rPr>
+          <w:rFonts w:ascii="Times New Roman" w:hAnsi="Times New Roman" w:cs="Times New Roman"/>
+        </w:rPr>
+        <w:drawing>
+          <wp:inline distT="0" distB="0" distL="0" distR="0" wp14:anchorId="4ABF31E2" wp14:editId="6931BA42">
+            <wp:extent cx="6120130" cy="2943860"/>
+            <wp:effectExtent l="0" t="0" r="0" b="8890"/>
+            <wp:docPr id="997606638" name="Picture 1"/>
+            <wp:cNvGraphicFramePr>
+              <a:graphicFrameLocks xmlns:a="http://schemas.openxmlformats.org/drawingml/2006/main" noChangeAspect="1"/>
+            </wp:cNvGraphicFramePr>
+            <a:graphic xmlns:a="http://schemas.openxmlformats.org/drawingml/2006/main">
+              <a:graphicData uri="http://schemas.openxmlformats.org/drawingml/2006/picture">
+                <pic:pic xmlns:pic="http://schemas.openxmlformats.org/drawingml/2006/picture">
+                  <pic:nvPicPr>
+                    <pic:cNvPr id="997606638" name=""/>
+                    <pic:cNvPicPr/>
+                  </pic:nvPicPr>
+                  <pic:blipFill>
+                    <a:blip r:embed="rId33"/>
+                    <a:stretch>
+                      <a:fillRect/>
+                    </a:stretch>
+                  </pic:blipFill>
+                  <pic:spPr>
+                    <a:xfrm>
+                      <a:off x="0" y="0"/>
+                      <a:ext cx="6120130" cy="2943860"/>
+                    </a:xfrm>
+                    <a:prstGeom prst="rect">
+                      <a:avLst/>
+                    </a:prstGeom>
+                  </pic:spPr>
+                </pic:pic>
+              </a:graphicData>
+            </a:graphic>
+          </wp:inline>
+        </w:drawing>
+      </w:r>
+    </w:p>
+    <w:p>
+      <w:pPr>
+        <w:rPr>
+          <w:rFonts w:ascii="Times New Roman" w:hAnsi="Times New Roman" w:cs="Times New Roman"/>
+        </w:rPr>
+      </w:pPr>
+      <w:r>
+        <w:rPr>
+          <w:rFonts w:ascii="Times New Roman" w:hAnsi="Times New Roman" w:cs="Times New Roman"/>
+          <w:b/>
+          <w:bCs/>
+        </w:rPr>
+        <w:lastRenderedPageBreak/>
+        <w:drawing>
+          <wp:anchor distT="0" distB="0" distL="114300" distR="114300" simplePos="0" relativeHeight="251661312" behindDoc="0" locked="0" layoutInCell="1" allowOverlap="1" wp14:anchorId="19AFC10F" wp14:editId="4194BAEF">
+            <wp:simplePos x="0" y="0"/>
+            <wp:positionH relativeFrom="column">
+              <wp:posOffset>3336925</wp:posOffset>
+            </wp:positionH>
+            <wp:positionV relativeFrom="paragraph">
+              <wp:posOffset>0</wp:posOffset>
+            </wp:positionV>
+            <wp:extent cx="3164205" cy="3077210"/>
+            <wp:effectExtent l="0" t="0" r="0" b="8890"/>
+            <wp:wrapSquare wrapText="bothSides"/>
+            <wp:docPr id="1195911737" name="Picture 1"/>
+            <wp:cNvGraphicFramePr>
+              <a:graphicFrameLocks xmlns:a="http://schemas.openxmlformats.org/drawingml/2006/main" noChangeAspect="1"/>
+            </wp:cNvGraphicFramePr>
+            <a:graphic xmlns:a="http://schemas.openxmlformats.org/drawingml/2006/main">
+              <a:graphicData uri="http://schemas.openxmlformats.org/drawingml/2006/picture">
+                <pic:pic xmlns:pic="http://schemas.openxmlformats.org/drawingml/2006/picture">
+                  <pic:nvPicPr>
+                    <pic:cNvPr id="1195911737" name=""/>
+                    <pic:cNvPicPr/>
+                  </pic:nvPicPr>
+                  <pic:blipFill>
+                    <a:blip r:embed="rId34">
+                      <a:extLst>
+                        <a:ext uri="{28A0092B-C50C-407E-A947-70E740481C1C}">
+                          <a14:useLocalDpi xmlns:a14="http://schemas.microsoft.com/office/drawing/2010/main" val="0"/>
+                        </a:ext>
+                      </a:extLst>
+                    </a:blip>
+                    <a:stretch>
+                      <a:fillRect/>
+                    </a:stretch>
+                  </pic:blipFill>
+                  <pic:spPr>
+                    <a:xfrm>
+                      <a:off x="0" y="0"/>
+                      <a:ext cx="3164205" cy="3077210"/>
+                    </a:xfrm>
+                    <a:prstGeom prst="rect">
+                      <a:avLst/>
+                    </a:prstGeom>
+                  </pic:spPr>
+                </pic:pic>
+              </a:graphicData>
+            </a:graphic>
+            <wp14:sizeRelH relativeFrom="margin">
+              <wp14:pctWidth>0</wp14:pctWidth>
+            </wp14:sizeRelH>
+            <wp14:sizeRelV relativeFrom="margin">
+              <wp14:pctHeight>0</wp14:pctHeight>
+            </wp14:sizeRelV>
+          </wp:anchor>
+        </w:drawing>
+      </w:r>
+      <w:proofErr w:type="spellStart"/>
+      <w:r>
+        <w:rPr>
+          <w:rFonts w:ascii="Times New Roman" w:hAnsi="Times New Roman" w:cs="Times New Roman"/>
+          <w:b/>
+          <w:bCs/>
+        </w:rPr>
+        <w:t>applySettings</w:t>
+      </w:r>
+      <w:proofErr w:type="spellEnd"/>
+      <w:r>
+        <w:rPr>
+          <w:rFonts w:ascii="Times New Roman" w:hAnsi="Times New Roman" w:cs="Times New Roman"/>
+          <w:b/>
+          <w:bCs/>
+        </w:rPr>
+        <w:t>(</w:t>
+      </w:r>
+      <w:r>
+        <w:rPr>
+          <w:rFonts w:ascii="Times New Roman" w:hAnsi="Times New Roman" w:cs="Times New Roman"/>
+          <w:b/>
+          <w:bCs/>
+        </w:rPr>
+        <w:t>size, bool</w:t>
+      </w:r>
+      <w:r>
+        <w:rPr>
+          <w:rFonts w:ascii="Times New Roman" w:hAnsi="Times New Roman" w:cs="Times New Roman"/>
+          <w:b/>
+          <w:bCs/>
+        </w:rPr>
+        <w:t>)</w:t>
+      </w:r>
+      <w:r>
+        <w:rPr>
+          <w:rFonts w:ascii="Times New Roman" w:hAnsi="Times New Roman" w:cs="Times New Roman"/>
+        </w:rPr>
+        <w:t xml:space="preserve"> </w:t>
+      </w:r>
+      <w:r>
+        <w:rPr>
+          <w:rFonts w:ascii="Times New Roman" w:hAnsi="Times New Roman" w:cs="Times New Roman"/>
+        </w:rPr>
+        <w:t xml:space="preserve">applies both accessibility preferences by calling </w:t>
+      </w:r>
+      <w:proofErr w:type="spellStart"/>
+      <w:r>
+        <w:rPr>
+          <w:rFonts w:ascii="Times New Roman" w:hAnsi="Times New Roman" w:cs="Times New Roman"/>
+        </w:rPr>
+        <w:t>applySize</w:t>
+      </w:r>
+      <w:proofErr w:type="spellEnd"/>
+      <w:r>
+        <w:rPr>
+          <w:rFonts w:ascii="Times New Roman" w:hAnsi="Times New Roman" w:cs="Times New Roman"/>
+        </w:rPr>
+        <w:t>(</w:t>
+      </w:r>
+      <w:r>
+        <w:rPr>
+          <w:rFonts w:ascii="Times New Roman" w:hAnsi="Times New Roman" w:cs="Times New Roman"/>
+        </w:rPr>
+        <w:t>size</w:t>
+      </w:r>
+      <w:r>
+        <w:rPr>
+          <w:rFonts w:ascii="Times New Roman" w:hAnsi="Times New Roman" w:cs="Times New Roman"/>
+        </w:rPr>
+        <w:t xml:space="preserve">) and </w:t>
+      </w:r>
+      <w:proofErr w:type="spellStart"/>
+      <w:r>
+        <w:rPr>
+          <w:rFonts w:ascii="Times New Roman" w:hAnsi="Times New Roman" w:cs="Times New Roman"/>
+        </w:rPr>
+        <w:t>highContrast</w:t>
+      </w:r>
+      <w:proofErr w:type="spellEnd"/>
+      <w:r>
+        <w:rPr>
+          <w:rFonts w:ascii="Times New Roman" w:hAnsi="Times New Roman" w:cs="Times New Roman"/>
+        </w:rPr>
+        <w:t>(</w:t>
+      </w:r>
+      <w:r>
+        <w:rPr>
+          <w:rFonts w:ascii="Times New Roman" w:hAnsi="Times New Roman" w:cs="Times New Roman"/>
+        </w:rPr>
+        <w:t>bool</w:t>
+      </w:r>
+      <w:r>
+        <w:rPr>
+          <w:rFonts w:ascii="Times New Roman" w:hAnsi="Times New Roman" w:cs="Times New Roman"/>
+        </w:rPr>
+        <w:t>).</w:t>
+      </w:r>
+    </w:p>
+    <w:p>
+      <w:pPr>
+        <w:rPr>
+          <w:rFonts w:ascii="Times New Roman" w:hAnsi="Times New Roman" w:cs="Times New Roman"/>
+        </w:rPr>
+      </w:pPr>
+      <w:r>
+        <w:rPr>
+          <w:rFonts w:ascii="Times New Roman" w:hAnsi="Times New Roman" w:cs="Times New Roman"/>
+        </w:rPr>
+        <w:t xml:space="preserve">- </w:t>
+      </w:r>
+      <w:proofErr w:type="spellStart"/>
+      <w:r>
+        <w:rPr>
+          <w:rFonts w:ascii="Times New Roman" w:hAnsi="Times New Roman" w:cs="Times New Roman"/>
+        </w:rPr>
+        <w:t>applySize</w:t>
+      </w:r>
+      <w:proofErr w:type="spellEnd"/>
+      <w:r>
+        <w:rPr>
+          <w:rFonts w:ascii="Times New Roman" w:hAnsi="Times New Roman" w:cs="Times New Roman"/>
+        </w:rPr>
+        <w:t xml:space="preserve">(size) sets the page’s root font size using the matching value in </w:t>
+      </w:r>
+      <w:proofErr w:type="spellStart"/>
+      <w:r>
+        <w:rPr>
+          <w:rFonts w:ascii="Times New Roman" w:hAnsi="Times New Roman" w:cs="Times New Roman"/>
+        </w:rPr>
+        <w:t>fontSizes.</w:t>
+      </w:r>
+      <w:r>
+        <w:rPr>
+          <w:rFonts w:ascii="Times New Roman" w:hAnsi="Times New Roman" w:cs="Times New Roman"/>
+        </w:rPr>
+        <w:t>It</w:t>
+      </w:r>
+      <w:proofErr w:type="spellEnd"/>
+      <w:r>
+        <w:rPr>
+          <w:rFonts w:ascii="Times New Roman" w:hAnsi="Times New Roman" w:cs="Times New Roman"/>
+        </w:rPr>
+        <w:t xml:space="preserve"> does this using a </w:t>
+      </w:r>
+      <w:proofErr w:type="spellStart"/>
+      <w:r>
+        <w:rPr>
+          <w:rFonts w:ascii="Times New Roman" w:hAnsi="Times New Roman" w:cs="Times New Roman"/>
+        </w:rPr>
+        <w:t>forEach</w:t>
+      </w:r>
+      <w:proofErr w:type="spellEnd"/>
+      <w:r>
+        <w:rPr>
+          <w:rFonts w:ascii="Times New Roman" w:hAnsi="Times New Roman" w:cs="Times New Roman"/>
+        </w:rPr>
+        <w:t xml:space="preserve"> loop which checks every button for a match.</w:t>
+      </w:r>
+      <w:r>
+        <w:rPr>
+          <w:rFonts w:ascii="Times New Roman" w:hAnsi="Times New Roman" w:cs="Times New Roman"/>
+        </w:rPr>
+        <w:t xml:space="preserve"> </w:t>
+      </w:r>
+      <w:r>
+        <w:rPr>
+          <w:rFonts w:ascii="Times New Roman" w:hAnsi="Times New Roman" w:cs="Times New Roman"/>
+        </w:rPr>
+        <w:t>Then it</w:t>
+      </w:r>
+      <w:r>
+        <w:rPr>
+          <w:rFonts w:ascii="Times New Roman" w:hAnsi="Times New Roman" w:cs="Times New Roman"/>
+        </w:rPr>
+        <w:t xml:space="preserve"> updates the size </w:t>
+      </w:r>
+      <w:r>
+        <w:rPr>
+          <w:rFonts w:ascii="Times New Roman" w:hAnsi="Times New Roman" w:cs="Times New Roman"/>
+        </w:rPr>
+        <w:t>buttons,</w:t>
+      </w:r>
+      <w:r>
+        <w:rPr>
+          <w:rFonts w:ascii="Times New Roman" w:hAnsi="Times New Roman" w:cs="Times New Roman"/>
+        </w:rPr>
+        <w:t xml:space="preserve"> so the chosen one appears selected, then saves the choice in </w:t>
+      </w:r>
+      <w:proofErr w:type="spellStart"/>
+      <w:r>
+        <w:rPr>
+          <w:rFonts w:ascii="Times New Roman" w:hAnsi="Times New Roman" w:cs="Times New Roman"/>
+        </w:rPr>
+        <w:t>localStorage</w:t>
+      </w:r>
+      <w:proofErr w:type="spellEnd"/>
+      <w:r>
+        <w:rPr>
+          <w:rFonts w:ascii="Times New Roman" w:hAnsi="Times New Roman" w:cs="Times New Roman"/>
+        </w:rPr>
+        <w:t xml:space="preserve"> as "</w:t>
+      </w:r>
+      <w:proofErr w:type="spellStart"/>
+      <w:r>
+        <w:rPr>
+          <w:rFonts w:ascii="Times New Roman" w:hAnsi="Times New Roman" w:cs="Times New Roman"/>
+        </w:rPr>
+        <w:t>textSize</w:t>
+      </w:r>
+      <w:proofErr w:type="spellEnd"/>
+      <w:r>
+        <w:rPr>
+          <w:rFonts w:ascii="Times New Roman" w:hAnsi="Times New Roman" w:cs="Times New Roman"/>
+        </w:rPr>
+        <w:t>".</w:t>
+      </w:r>
+    </w:p>
+    <w:p>
+      <w:pPr>
+        <w:rPr>
+          <w:rFonts w:ascii="Times New Roman" w:hAnsi="Times New Roman" w:cs="Times New Roman"/>
+        </w:rPr>
+      </w:pPr>
+      <w:r>
+        <w:rPr>
+          <w:rFonts w:ascii="Times New Roman" w:hAnsi="Times New Roman" w:cs="Times New Roman"/>
+        </w:rPr>
+        <w:drawing>
+          <wp:inline distT="0" distB="0" distL="0" distR="0" wp14:anchorId="6FA84D81" wp14:editId="487590DF">
+            <wp:extent cx="3221467" cy="760624"/>
+            <wp:effectExtent l="0" t="0" r="0" b="1905"/>
+            <wp:docPr id="420431931" name="Picture 1"/>
+            <wp:cNvGraphicFramePr>
+              <a:graphicFrameLocks xmlns:a="http://schemas.openxmlformats.org/drawingml/2006/main" noChangeAspect="1"/>
+            </wp:cNvGraphicFramePr>
+            <a:graphic xmlns:a="http://schemas.openxmlformats.org/drawingml/2006/main">
+              <a:graphicData uri="http://schemas.openxmlformats.org/drawingml/2006/picture">
+                <pic:pic xmlns:pic="http://schemas.openxmlformats.org/drawingml/2006/picture">
+                  <pic:nvPicPr>
+                    <pic:cNvPr id="420431931" name=""/>
+                    <pic:cNvPicPr/>
+                  </pic:nvPicPr>
+                  <pic:blipFill>
+                    <a:blip r:embed="rId35"/>
+                    <a:stretch>
+                      <a:fillRect/>
+                    </a:stretch>
+                  </pic:blipFill>
+                  <pic:spPr>
+                    <a:xfrm>
+                      <a:off x="0" y="0"/>
+                      <a:ext cx="3256861" cy="768981"/>
+                    </a:xfrm>
+                    <a:prstGeom prst="rect">
+                      <a:avLst/>
+                    </a:prstGeom>
+                  </pic:spPr>
+                </pic:pic>
+              </a:graphicData>
+            </a:graphic>
+          </wp:inline>
+        </w:drawing>
+      </w:r>
+    </w:p>
+    <w:p>
+      <w:pPr>
+        <w:rPr>
+          <w:rFonts w:ascii="Times New Roman" w:hAnsi="Times New Roman" w:cs="Times New Roman"/>
+        </w:rPr>
+      </w:pPr>
+    </w:p>
+    <w:p>
+      <w:pPr>
+        <w:rPr>
+          <w:rFonts w:ascii="Times New Roman" w:hAnsi="Times New Roman" w:cs="Times New Roman"/>
+        </w:rPr>
+      </w:pPr>
+      <w:r>
+        <w:rPr>
+          <w:rFonts w:ascii="Times New Roman" w:hAnsi="Times New Roman" w:cs="Times New Roman"/>
+        </w:rPr>
+        <w:t xml:space="preserve">- </w:t>
+      </w:r>
+      <w:proofErr w:type="spellStart"/>
+      <w:r>
+        <w:rPr>
+          <w:rFonts w:ascii="Times New Roman" w:hAnsi="Times New Roman" w:cs="Times New Roman"/>
+        </w:rPr>
+        <w:t>highContrast</w:t>
+      </w:r>
+      <w:proofErr w:type="spellEnd"/>
+      <w:r>
+        <w:rPr>
+          <w:rFonts w:ascii="Times New Roman" w:hAnsi="Times New Roman" w:cs="Times New Roman"/>
+        </w:rPr>
+        <w:t xml:space="preserve">(bool) adds or removes the high-contrast class on the root element, updates the switch’s appearance and aria-checked state, and saves the setting in </w:t>
+      </w:r>
+      <w:proofErr w:type="spellStart"/>
+      <w:r>
+        <w:rPr>
+          <w:rFonts w:ascii="Times New Roman" w:hAnsi="Times New Roman" w:cs="Times New Roman"/>
+        </w:rPr>
+        <w:t>localStorage</w:t>
+      </w:r>
+      <w:proofErr w:type="spellEnd"/>
+      <w:r>
+        <w:rPr>
+          <w:rFonts w:ascii="Times New Roman" w:hAnsi="Times New Roman" w:cs="Times New Roman"/>
+        </w:rPr>
+        <w:t xml:space="preserve"> as "contrast".</w:t>
+      </w:r>
+    </w:p>
+    <w:p>
+      <w:pPr>
+        <w:rPr>
+          <w:rFonts w:ascii="Times New Roman" w:hAnsi="Times New Roman" w:cs="Times New Roman"/>
+        </w:rPr>
+      </w:pPr>
+      <w:r>
+        <w:rPr>
+          <w:rFonts w:ascii="Times New Roman" w:hAnsi="Times New Roman" w:cs="Times New Roman"/>
+        </w:rPr>
+        <w:t>Together, these functions apply the selected settings and save them so they can be restored later</w:t>
+      </w:r>
+      <w:r>
+        <w:rPr>
+          <w:rFonts w:ascii="Times New Roman" w:hAnsi="Times New Roman" w:cs="Times New Roman"/>
+        </w:rPr>
+        <w:t xml:space="preserve"> on document load</w:t>
+      </w:r>
+      <w:r>
+        <w:rPr>
+          <w:rFonts w:ascii="Times New Roman" w:hAnsi="Times New Roman" w:cs="Times New Roman"/>
+        </w:rPr>
+        <w:t>.</w:t>
+      </w:r>
+    </w:p>
+    <w:p>
+      <w:pPr>
+        <w:rPr>
+          <w:rFonts w:ascii="Times New Roman" w:hAnsi="Times New Roman" w:cs="Times New Roman"/>
+        </w:rPr>
+      </w:pPr>
+    </w:p>
+    <w:p>
+      <w:pPr>
+        <w:rPr>
+          <w:rFonts w:ascii="Times New Roman" w:hAnsi="Times New Roman" w:cs="Times New Roman"/>
+        </w:rPr>
+      </w:pPr>
+      <w:r>
+        <w:rPr>
+          <w:rFonts w:ascii="Times New Roman" w:hAnsi="Times New Roman" w:cs="Times New Roman"/>
+          <w:b/>
+          <w:bCs/>
+        </w:rPr>
+        <w:t>The persistence method</w:t>
+      </w:r>
+      <w:r>
+        <w:rPr>
+          <w:rFonts w:ascii="Times New Roman" w:hAnsi="Times New Roman" w:cs="Times New Roman"/>
+        </w:rPr>
+        <w:t xml:space="preserve"> I chose</w:t>
+      </w:r>
+      <w:r>
+        <w:rPr>
+          <w:rFonts w:ascii="Times New Roman" w:hAnsi="Times New Roman" w:cs="Times New Roman"/>
+        </w:rPr>
+        <w:t xml:space="preserve"> is </w:t>
+      </w:r>
+      <w:proofErr w:type="spellStart"/>
+      <w:r>
+        <w:rPr>
+          <w:rFonts w:ascii="Times New Roman" w:hAnsi="Times New Roman" w:cs="Times New Roman"/>
+        </w:rPr>
+        <w:t>localStorage</w:t>
+      </w:r>
+      <w:proofErr w:type="spellEnd"/>
+      <w:r>
+        <w:rPr>
+          <w:rFonts w:ascii="Times New Roman" w:hAnsi="Times New Roman" w:cs="Times New Roman"/>
+        </w:rPr>
+        <w:t xml:space="preserve">. </w:t>
+      </w:r>
+      <w:r>
+        <w:rPr>
+          <w:rFonts w:ascii="Times New Roman" w:hAnsi="Times New Roman" w:cs="Times New Roman"/>
+        </w:rPr>
+        <w:t>When a button in the Size part of the Accessibility panel is clicked, it</w:t>
+      </w:r>
+      <w:r>
+        <w:rPr>
+          <w:rFonts w:ascii="Times New Roman" w:hAnsi="Times New Roman" w:cs="Times New Roman"/>
+        </w:rPr>
+        <w:t xml:space="preserve"> saves the text size under "</w:t>
+      </w:r>
+      <w:proofErr w:type="spellStart"/>
+      <w:r>
+        <w:rPr>
+          <w:rFonts w:ascii="Times New Roman" w:hAnsi="Times New Roman" w:cs="Times New Roman"/>
+        </w:rPr>
+        <w:t>textSize</w:t>
+      </w:r>
+      <w:proofErr w:type="spellEnd"/>
+      <w:r>
+        <w:rPr>
+          <w:rFonts w:ascii="Times New Roman" w:hAnsi="Times New Roman" w:cs="Times New Roman"/>
+        </w:rPr>
+        <w:t xml:space="preserve">" and </w:t>
+      </w:r>
+      <w:r>
+        <w:rPr>
+          <w:rFonts w:ascii="Times New Roman" w:hAnsi="Times New Roman" w:cs="Times New Roman"/>
+        </w:rPr>
+        <w:t xml:space="preserve">when the slider is clicked, it saves </w:t>
+      </w:r>
+      <w:r>
+        <w:rPr>
+          <w:rFonts w:ascii="Times New Roman" w:hAnsi="Times New Roman" w:cs="Times New Roman"/>
+        </w:rPr>
+        <w:t xml:space="preserve">the contrast state under "contrast". </w:t>
+      </w:r>
+    </w:p>
+    <w:p>
+      <w:pPr>
+        <w:rPr>
+          <w:rFonts w:ascii="Times New Roman" w:hAnsi="Times New Roman" w:cs="Times New Roman"/>
+        </w:rPr>
+      </w:pPr>
+      <w:r>
+        <w:rPr>
+          <w:rFonts w:ascii="Times New Roman" w:hAnsi="Times New Roman" w:cs="Times New Roman"/>
+        </w:rPr>
+        <w:t>These values remain in the browser</w:t>
+      </w:r>
+      <w:r>
+        <w:rPr>
+          <w:rFonts w:ascii="Times New Roman" w:hAnsi="Times New Roman" w:cs="Times New Roman"/>
+        </w:rPr>
+        <w:t xml:space="preserve">’s </w:t>
+      </w:r>
+      <w:proofErr w:type="spellStart"/>
+      <w:r>
+        <w:rPr>
+          <w:rFonts w:ascii="Times New Roman" w:hAnsi="Times New Roman" w:cs="Times New Roman"/>
+        </w:rPr>
+        <w:t>localStorage</w:t>
+      </w:r>
+      <w:proofErr w:type="spellEnd"/>
+      <w:r>
+        <w:rPr>
+          <w:rFonts w:ascii="Times New Roman" w:hAnsi="Times New Roman" w:cs="Times New Roman"/>
+        </w:rPr>
+        <w:t xml:space="preserve"> after the page is closed or reloaded.</w:t>
+      </w:r>
+      <w:r>
+        <w:rPr>
+          <w:rFonts w:ascii="Times New Roman" w:hAnsi="Times New Roman" w:cs="Times New Roman"/>
+        </w:rPr>
+        <w:t xml:space="preserve"> </w:t>
+      </w:r>
+      <w:r>
+        <w:rPr>
+          <w:rFonts w:ascii="Times New Roman" w:hAnsi="Times New Roman" w:cs="Times New Roman"/>
+        </w:rPr>
+        <w:t xml:space="preserve">When the </w:t>
+      </w:r>
+      <w:r>
+        <w:rPr>
+          <w:rFonts w:ascii="Times New Roman" w:hAnsi="Times New Roman" w:cs="Times New Roman"/>
+        </w:rPr>
+        <w:t>DOM</w:t>
+      </w:r>
+      <w:r>
+        <w:rPr>
+          <w:rFonts w:ascii="Times New Roman" w:hAnsi="Times New Roman" w:cs="Times New Roman"/>
+        </w:rPr>
+        <w:t xml:space="preserve"> loads, </w:t>
+      </w:r>
+      <w:r>
+        <w:rPr>
+          <w:rFonts w:ascii="Times New Roman" w:hAnsi="Times New Roman" w:cs="Times New Roman"/>
+        </w:rPr>
+        <w:t>the</w:t>
+      </w:r>
+      <w:r>
+        <w:rPr>
+          <w:rFonts w:ascii="Times New Roman" w:hAnsi="Times New Roman" w:cs="Times New Roman"/>
+        </w:rPr>
+        <w:t xml:space="preserve"> code reads the saved values with </w:t>
+      </w:r>
+      <w:proofErr w:type="spellStart"/>
+      <w:r>
+        <w:rPr>
+          <w:rFonts w:ascii="Times New Roman" w:hAnsi="Times New Roman" w:cs="Times New Roman"/>
+        </w:rPr>
+        <w:t>localStorage.getItem</w:t>
+      </w:r>
+      <w:proofErr w:type="spellEnd"/>
+      <w:r>
+        <w:rPr>
+          <w:rFonts w:ascii="Times New Roman" w:hAnsi="Times New Roman" w:cs="Times New Roman"/>
+        </w:rPr>
+        <w:t xml:space="preserve">() and passes them to </w:t>
+      </w:r>
+      <w:proofErr w:type="spellStart"/>
+      <w:r>
+        <w:rPr>
+          <w:rFonts w:ascii="Times New Roman" w:hAnsi="Times New Roman" w:cs="Times New Roman"/>
+        </w:rPr>
+        <w:t>applySettings</w:t>
+      </w:r>
+      <w:proofErr w:type="spellEnd"/>
+      <w:r>
+        <w:rPr>
+          <w:rFonts w:ascii="Times New Roman" w:hAnsi="Times New Roman" w:cs="Times New Roman"/>
+        </w:rPr>
+        <w:t>(), which restores the preferences.</w:t>
+      </w:r>
+    </w:p>
+    <w:p>
+      <w:pPr>
+        <w:rPr>
+          <w:rFonts w:ascii="Times New Roman" w:hAnsi="Times New Roman" w:cs="Times New Roman"/>
+        </w:rPr>
+      </w:pPr>
+    </w:p>
+    <w:p>
+      <w:pPr>
+        <w:rPr>
+          <w:rFonts w:ascii="Times New Roman" w:hAnsi="Times New Roman" w:cs="Times New Roman"/>
+        </w:rPr>
+      </w:pPr>
+      <w:r>
+        <w:rPr>
+          <w:rFonts w:ascii="Times New Roman" w:hAnsi="Times New Roman" w:cs="Times New Roman"/>
+          <w:b/>
+          <w:bCs/>
+        </w:rPr>
+        <w:t>Accessibility test:</w:t>
+      </w:r>
+      <w:r>
+        <w:rPr>
+          <w:rFonts w:ascii="Times New Roman" w:hAnsi="Times New Roman" w:cs="Times New Roman"/>
+        </w:rPr>
+        <w:t xml:space="preserve"> Using only the keyboard, I tabbed to the high-contrast switch and pressed Space. </w:t>
+      </w:r>
+    </w:p>
+    <w:p>
+      <w:pPr>
+        <w:rPr>
+          <w:rFonts w:ascii="Times New Roman" w:hAnsi="Times New Roman" w:cs="Times New Roman"/>
+        </w:rPr>
+      </w:pPr>
+    </w:p>
+    <w:p>
+      <w:pPr>
+        <w:rPr>
+          <w:rFonts w:ascii="Times New Roman" w:hAnsi="Times New Roman" w:cs="Times New Roman"/>
+        </w:rPr>
+      </w:pPr>
+      <w:r>
+        <w:rPr>
+          <w:rFonts w:ascii="Times New Roman" w:hAnsi="Times New Roman" w:cs="Times New Roman"/>
+        </w:rPr>
+        <w:t xml:space="preserve">The switch changed state, aria-checked updated, and the page </w:t>
+      </w:r>
+      <w:proofErr w:type="spellStart"/>
+      <w:r>
+        <w:rPr>
+          <w:rFonts w:ascii="Times New Roman" w:hAnsi="Times New Roman" w:cs="Times New Roman"/>
+        </w:rPr>
+        <w:t>colors</w:t>
+      </w:r>
+      <w:proofErr w:type="spellEnd"/>
+      <w:r>
+        <w:rPr>
+          <w:rFonts w:ascii="Times New Roman" w:hAnsi="Times New Roman" w:cs="Times New Roman"/>
+        </w:rPr>
+        <w:t xml:space="preserve"> changed. This checks keyboard access and that the switch communicates its state to assistive technology.</w:t>
+      </w:r>
+    </w:p>
+    <w:p>
+      <w:pPr>
+        <w:rPr>
+          <w:rFonts w:ascii="Times New Roman" w:hAnsi="Times New Roman" w:cs="Times New Roman"/>
+        </w:rPr>
+      </w:pPr>
     </w:p>
     <w:sectPr>
       <w:pgSz w:w="11906" w:h="16838"/>
@@ -6990,7 +8754,6 @@
   <w:style w:type="character" w:default="1" w:styleId="DefaultParagraphFont">
     <w:name w:val="Default Paragraph Font"/>
     <w:uiPriority w:val="1"/>
-    <w:semiHidden/>
     <w:unhideWhenUsed/>
   </w:style>
   <w:style w:type="table" w:default="1" w:styleId="TableNormal">

</xml_diff>